<commit_message>
Update React Training Module and Project Structure
- Revised the "Modul Pelatihan React" document to reflect updates in content and structure.
- Updated the package.json to include Tailwind CSS dependencies.
- Modified pnpm-lock.yaml to include new Tailwind CSS packages.
- Removed App.css in favor of Tailwind CSS for styling.
- Created Header and JobCard components with Tailwind CSS styles.
- Updated JobList component to utilize JobCard props for dynamic data rendering.
- Adjusted index.css to import Tailwind CSS.
- Updated vite.config.js to include Tailwind CSS plugin.
- Added new versions of the training module documents in both .docx and .pdf formats.
</commit_message>
<xml_diff>
--- a/dokumen/Modul Pelatihan React v4.0.docx
+++ b/dokumen/Modul Pelatihan React v4.0.docx
@@ -85,7 +85,7 @@
       <w:pPr>
         <w:pStyle w:val="Heading1"/>
       </w:pPr>
-      <w:bookmarkStart w:id="0" w:name="_Toc234532593"/>
+      <w:bookmarkStart w:id="0" w:name="_Toc235049341"/>
       <w:r>
         <w:lastRenderedPageBreak/>
         <w:t>KATA PENGANTAR</w:t>
@@ -235,7 +235,7 @@
       <w:pPr>
         <w:pStyle w:val="Heading1"/>
       </w:pPr>
-      <w:bookmarkStart w:id="1" w:name="_Toc234532594"/>
+      <w:bookmarkStart w:id="1" w:name="_Toc235049342"/>
       <w:r>
         <w:lastRenderedPageBreak/>
         <w:t>DAFTAR ISI</w:t>
@@ -291,7 +291,7 @@
           <w:r>
             <w:fldChar w:fldCharType="separate"/>
           </w:r>
-          <w:hyperlink w:anchor="_Toc234532593" w:history="1">
+          <w:hyperlink w:anchor="_Toc235049341" w:history="1">
             <w:r>
               <w:rPr>
                 <w:rStyle w:val="Hyperlink"/>
@@ -314,7 +314,7 @@
               <w:rPr>
                 <w:webHidden/>
               </w:rPr>
-              <w:instrText xml:space="preserve"> PAGEREF _Toc234532593 \h </w:instrText>
+              <w:instrText xml:space="preserve"> PAGEREF _Toc235049341 \h </w:instrText>
             </w:r>
             <w:r>
               <w:rPr>
@@ -351,7 +351,7 @@
               <w:lang w:eastAsia="en-ID"/>
             </w:rPr>
           </w:pPr>
-          <w:hyperlink w:anchor="_Toc234532594" w:history="1">
+          <w:hyperlink w:anchor="_Toc235049342" w:history="1">
             <w:r>
               <w:rPr>
                 <w:rStyle w:val="Hyperlink"/>
@@ -374,7 +374,7 @@
               <w:rPr>
                 <w:webHidden/>
               </w:rPr>
-              <w:instrText xml:space="preserve"> PAGEREF _Toc234532594 \h </w:instrText>
+              <w:instrText xml:space="preserve"> PAGEREF _Toc235049342 \h </w:instrText>
             </w:r>
             <w:r>
               <w:rPr>
@@ -411,7 +411,7 @@
               <w:lang w:eastAsia="en-ID"/>
             </w:rPr>
           </w:pPr>
-          <w:hyperlink w:anchor="_Toc234532595" w:history="1">
+          <w:hyperlink w:anchor="_Toc235049343" w:history="1">
             <w:r>
               <w:rPr>
                 <w:rStyle w:val="Hyperlink"/>
@@ -434,7 +434,7 @@
               <w:rPr>
                 <w:webHidden/>
               </w:rPr>
-              <w:instrText xml:space="preserve"> PAGEREF _Toc234532595 \h </w:instrText>
+              <w:instrText xml:space="preserve"> PAGEREF _Toc235049343 \h </w:instrText>
             </w:r>
             <w:r>
               <w:rPr>
@@ -474,7 +474,7 @@
               <w:lang w:eastAsia="en-ID"/>
             </w:rPr>
           </w:pPr>
-          <w:hyperlink w:anchor="_Toc234532596" w:history="1">
+          <w:hyperlink w:anchor="_Toc235049344" w:history="1">
             <w:r>
               <w:rPr>
                 <w:rStyle w:val="Hyperlink"/>
@@ -516,7 +516,7 @@
                 <w:noProof/>
                 <w:webHidden/>
               </w:rPr>
-              <w:instrText xml:space="preserve"> PAGEREF _Toc234532596 \h </w:instrText>
+              <w:instrText xml:space="preserve"> PAGEREF _Toc235049344 \h </w:instrText>
             </w:r>
             <w:r>
               <w:rPr>
@@ -560,7 +560,7 @@
               <w:lang w:eastAsia="en-ID"/>
             </w:rPr>
           </w:pPr>
-          <w:hyperlink w:anchor="_Toc234532597" w:history="1">
+          <w:hyperlink w:anchor="_Toc235049345" w:history="1">
             <w:r>
               <w:rPr>
                 <w:rStyle w:val="Hyperlink"/>
@@ -602,7 +602,7 @@
                 <w:noProof/>
                 <w:webHidden/>
               </w:rPr>
-              <w:instrText xml:space="preserve"> PAGEREF _Toc234532597 \h </w:instrText>
+              <w:instrText xml:space="preserve"> PAGEREF _Toc235049345 \h </w:instrText>
             </w:r>
             <w:r>
               <w:rPr>
@@ -646,7 +646,7 @@
               <w:lang w:eastAsia="en-ID"/>
             </w:rPr>
           </w:pPr>
-          <w:hyperlink w:anchor="_Toc234532598" w:history="1">
+          <w:hyperlink w:anchor="_Toc235049346" w:history="1">
             <w:r>
               <w:rPr>
                 <w:rStyle w:val="Hyperlink"/>
@@ -688,7 +688,7 @@
                 <w:noProof/>
                 <w:webHidden/>
               </w:rPr>
-              <w:instrText xml:space="preserve"> PAGEREF _Toc234532598 \h </w:instrText>
+              <w:instrText xml:space="preserve"> PAGEREF _Toc235049346 \h </w:instrText>
             </w:r>
             <w:r>
               <w:rPr>
@@ -732,7 +732,7 @@
               <w:lang w:eastAsia="en-ID"/>
             </w:rPr>
           </w:pPr>
-          <w:hyperlink w:anchor="_Toc234532599" w:history="1">
+          <w:hyperlink w:anchor="_Toc235049347" w:history="1">
             <w:r>
               <w:rPr>
                 <w:rStyle w:val="Hyperlink"/>
@@ -774,7 +774,7 @@
                 <w:noProof/>
                 <w:webHidden/>
               </w:rPr>
-              <w:instrText xml:space="preserve"> PAGEREF _Toc234532599 \h </w:instrText>
+              <w:instrText xml:space="preserve"> PAGEREF _Toc235049347 \h </w:instrText>
             </w:r>
             <w:r>
               <w:rPr>
@@ -818,7 +818,7 @@
               <w:lang w:eastAsia="en-ID"/>
             </w:rPr>
           </w:pPr>
-          <w:hyperlink w:anchor="_Toc234532600" w:history="1">
+          <w:hyperlink w:anchor="_Toc235049348" w:history="1">
             <w:r>
               <w:rPr>
                 <w:rStyle w:val="Hyperlink"/>
@@ -860,7 +860,7 @@
                 <w:noProof/>
                 <w:webHidden/>
               </w:rPr>
-              <w:instrText xml:space="preserve"> PAGEREF _Toc234532600 \h </w:instrText>
+              <w:instrText xml:space="preserve"> PAGEREF _Toc235049348 \h </w:instrText>
             </w:r>
             <w:r>
               <w:rPr>
@@ -904,7 +904,7 @@
               <w:lang w:eastAsia="en-ID"/>
             </w:rPr>
           </w:pPr>
-          <w:hyperlink w:anchor="_Toc234532601" w:history="1">
+          <w:hyperlink w:anchor="_Toc235049349" w:history="1">
             <w:r>
               <w:rPr>
                 <w:rStyle w:val="Hyperlink"/>
@@ -946,7 +946,7 @@
                 <w:noProof/>
                 <w:webHidden/>
               </w:rPr>
-              <w:instrText xml:space="preserve"> PAGEREF _Toc234532601 \h </w:instrText>
+              <w:instrText xml:space="preserve"> PAGEREF _Toc235049349 \h </w:instrText>
             </w:r>
             <w:r>
               <w:rPr>
@@ -990,7 +990,7 @@
               <w:lang w:eastAsia="en-ID"/>
             </w:rPr>
           </w:pPr>
-          <w:hyperlink w:anchor="_Toc234532602" w:history="1">
+          <w:hyperlink w:anchor="_Toc235049350" w:history="1">
             <w:r>
               <w:rPr>
                 <w:rStyle w:val="Hyperlink"/>
@@ -1032,7 +1032,7 @@
                 <w:noProof/>
                 <w:webHidden/>
               </w:rPr>
-              <w:instrText xml:space="preserve"> PAGEREF _Toc234532602 \h </w:instrText>
+              <w:instrText xml:space="preserve"> PAGEREF _Toc235049350 \h </w:instrText>
             </w:r>
             <w:r>
               <w:rPr>
@@ -1073,7 +1073,7 @@
               <w:lang w:eastAsia="en-ID"/>
             </w:rPr>
           </w:pPr>
-          <w:hyperlink w:anchor="_Toc234532603" w:history="1">
+          <w:hyperlink w:anchor="_Toc235049351" w:history="1">
             <w:r>
               <w:rPr>
                 <w:rStyle w:val="Hyperlink"/>
@@ -1096,7 +1096,7 @@
               <w:rPr>
                 <w:webHidden/>
               </w:rPr>
-              <w:instrText xml:space="preserve"> PAGEREF _Toc234532603 \h </w:instrText>
+              <w:instrText xml:space="preserve"> PAGEREF _Toc235049351 \h </w:instrText>
             </w:r>
             <w:r>
               <w:rPr>
@@ -1136,7 +1136,7 @@
               <w:lang w:eastAsia="en-ID"/>
             </w:rPr>
           </w:pPr>
-          <w:hyperlink w:anchor="_Toc234532604" w:history="1">
+          <w:hyperlink w:anchor="_Toc235049352" w:history="1">
             <w:r>
               <w:rPr>
                 <w:rStyle w:val="Hyperlink"/>
@@ -1178,7 +1178,7 @@
                 <w:noProof/>
                 <w:webHidden/>
               </w:rPr>
-              <w:instrText xml:space="preserve"> PAGEREF _Toc234532604 \h </w:instrText>
+              <w:instrText xml:space="preserve"> PAGEREF _Toc235049352 \h </w:instrText>
             </w:r>
             <w:r>
               <w:rPr>
@@ -1222,7 +1222,7 @@
               <w:lang w:eastAsia="en-ID"/>
             </w:rPr>
           </w:pPr>
-          <w:hyperlink w:anchor="_Toc234532605" w:history="1">
+          <w:hyperlink w:anchor="_Toc235049353" w:history="1">
             <w:r>
               <w:rPr>
                 <w:rStyle w:val="Hyperlink"/>
@@ -1264,7 +1264,7 @@
                 <w:noProof/>
                 <w:webHidden/>
               </w:rPr>
-              <w:instrText xml:space="preserve"> PAGEREF _Toc234532605 \h </w:instrText>
+              <w:instrText xml:space="preserve"> PAGEREF _Toc235049353 \h </w:instrText>
             </w:r>
             <w:r>
               <w:rPr>
@@ -1308,7 +1308,7 @@
               <w:lang w:eastAsia="en-ID"/>
             </w:rPr>
           </w:pPr>
-          <w:hyperlink w:anchor="_Toc234532606" w:history="1">
+          <w:hyperlink w:anchor="_Toc235049354" w:history="1">
             <w:r>
               <w:rPr>
                 <w:rStyle w:val="Hyperlink"/>
@@ -1350,7 +1350,7 @@
                 <w:noProof/>
                 <w:webHidden/>
               </w:rPr>
-              <w:instrText xml:space="preserve"> PAGEREF _Toc234532606 \h </w:instrText>
+              <w:instrText xml:space="preserve"> PAGEREF _Toc235049354 \h </w:instrText>
             </w:r>
             <w:r>
               <w:rPr>
@@ -1394,7 +1394,7 @@
               <w:lang w:eastAsia="en-ID"/>
             </w:rPr>
           </w:pPr>
-          <w:hyperlink w:anchor="_Toc234532607" w:history="1">
+          <w:hyperlink w:anchor="_Toc235049355" w:history="1">
             <w:r>
               <w:rPr>
                 <w:rStyle w:val="Hyperlink"/>
@@ -1436,7 +1436,7 @@
                 <w:noProof/>
                 <w:webHidden/>
               </w:rPr>
-              <w:instrText xml:space="preserve"> PAGEREF _Toc234532607 \h </w:instrText>
+              <w:instrText xml:space="preserve"> PAGEREF _Toc235049355 \h </w:instrText>
             </w:r>
             <w:r>
               <w:rPr>
@@ -1480,7 +1480,7 @@
               <w:lang w:eastAsia="en-ID"/>
             </w:rPr>
           </w:pPr>
-          <w:hyperlink w:anchor="_Toc234532608" w:history="1">
+          <w:hyperlink w:anchor="_Toc235049356" w:history="1">
             <w:r>
               <w:rPr>
                 <w:rStyle w:val="Hyperlink"/>
@@ -1522,7 +1522,7 @@
                 <w:noProof/>
                 <w:webHidden/>
               </w:rPr>
-              <w:instrText xml:space="preserve"> PAGEREF _Toc234532608 \h </w:instrText>
+              <w:instrText xml:space="preserve"> PAGEREF _Toc235049356 \h </w:instrText>
             </w:r>
             <w:r>
               <w:rPr>
@@ -1566,7 +1566,7 @@
               <w:lang w:eastAsia="en-ID"/>
             </w:rPr>
           </w:pPr>
-          <w:hyperlink w:anchor="_Toc234532609" w:history="1">
+          <w:hyperlink w:anchor="_Toc235049357" w:history="1">
             <w:r>
               <w:rPr>
                 <w:rStyle w:val="Hyperlink"/>
@@ -1608,7 +1608,7 @@
                 <w:noProof/>
                 <w:webHidden/>
               </w:rPr>
-              <w:instrText xml:space="preserve"> PAGEREF _Toc234532609 \h </w:instrText>
+              <w:instrText xml:space="preserve"> PAGEREF _Toc235049357 \h </w:instrText>
             </w:r>
             <w:r>
               <w:rPr>
@@ -1649,7 +1649,7 @@
               <w:lang w:eastAsia="en-ID"/>
             </w:rPr>
           </w:pPr>
-          <w:hyperlink w:anchor="_Toc234532610" w:history="1">
+          <w:hyperlink w:anchor="_Toc235049358" w:history="1">
             <w:r>
               <w:rPr>
                 <w:rStyle w:val="Hyperlink"/>
@@ -1672,7 +1672,7 @@
               <w:rPr>
                 <w:webHidden/>
               </w:rPr>
-              <w:instrText xml:space="preserve"> PAGEREF _Toc234532610 \h </w:instrText>
+              <w:instrText xml:space="preserve"> PAGEREF _Toc235049358 \h </w:instrText>
             </w:r>
             <w:r>
               <w:rPr>
@@ -1712,7 +1712,7 @@
               <w:lang w:eastAsia="en-ID"/>
             </w:rPr>
           </w:pPr>
-          <w:hyperlink w:anchor="_Toc234532611" w:history="1">
+          <w:hyperlink w:anchor="_Toc235049359" w:history="1">
             <w:r>
               <w:rPr>
                 <w:rStyle w:val="Hyperlink"/>
@@ -1754,7 +1754,7 @@
                 <w:noProof/>
                 <w:webHidden/>
               </w:rPr>
-              <w:instrText xml:space="preserve"> PAGEREF _Toc234532611 \h </w:instrText>
+              <w:instrText xml:space="preserve"> PAGEREF _Toc235049359 \h </w:instrText>
             </w:r>
             <w:r>
               <w:rPr>
@@ -1798,7 +1798,7 @@
               <w:lang w:eastAsia="en-ID"/>
             </w:rPr>
           </w:pPr>
-          <w:hyperlink w:anchor="_Toc234532612" w:history="1">
+          <w:hyperlink w:anchor="_Toc235049360" w:history="1">
             <w:r>
               <w:rPr>
                 <w:rStyle w:val="Hyperlink"/>
@@ -1840,7 +1840,7 @@
                 <w:noProof/>
                 <w:webHidden/>
               </w:rPr>
-              <w:instrText xml:space="preserve"> PAGEREF _Toc234532612 \h </w:instrText>
+              <w:instrText xml:space="preserve"> PAGEREF _Toc235049360 \h </w:instrText>
             </w:r>
             <w:r>
               <w:rPr>
@@ -1884,7 +1884,7 @@
               <w:lang w:eastAsia="en-ID"/>
             </w:rPr>
           </w:pPr>
-          <w:hyperlink w:anchor="_Toc234532613" w:history="1">
+          <w:hyperlink w:anchor="_Toc235049361" w:history="1">
             <w:r>
               <w:rPr>
                 <w:rStyle w:val="Hyperlink"/>
@@ -1926,7 +1926,7 @@
                 <w:noProof/>
                 <w:webHidden/>
               </w:rPr>
-              <w:instrText xml:space="preserve"> PAGEREF _Toc234532613 \h </w:instrText>
+              <w:instrText xml:space="preserve"> PAGEREF _Toc235049361 \h </w:instrText>
             </w:r>
             <w:r>
               <w:rPr>
@@ -1970,7 +1970,7 @@
               <w:lang w:eastAsia="en-ID"/>
             </w:rPr>
           </w:pPr>
-          <w:hyperlink w:anchor="_Toc234532614" w:history="1">
+          <w:hyperlink w:anchor="_Toc235049362" w:history="1">
             <w:r>
               <w:rPr>
                 <w:rStyle w:val="Hyperlink"/>
@@ -2012,7 +2012,7 @@
                 <w:noProof/>
                 <w:webHidden/>
               </w:rPr>
-              <w:instrText xml:space="preserve"> PAGEREF _Toc234532614 \h </w:instrText>
+              <w:instrText xml:space="preserve"> PAGEREF _Toc235049362 \h </w:instrText>
             </w:r>
             <w:r>
               <w:rPr>
@@ -2056,7 +2056,7 @@
               <w:lang w:eastAsia="en-ID"/>
             </w:rPr>
           </w:pPr>
-          <w:hyperlink w:anchor="_Toc234532615" w:history="1">
+          <w:hyperlink w:anchor="_Toc235049363" w:history="1">
             <w:r>
               <w:rPr>
                 <w:rStyle w:val="Hyperlink"/>
@@ -2098,7 +2098,7 @@
                 <w:noProof/>
                 <w:webHidden/>
               </w:rPr>
-              <w:instrText xml:space="preserve"> PAGEREF _Toc234532615 \h </w:instrText>
+              <w:instrText xml:space="preserve"> PAGEREF _Toc235049363 \h </w:instrText>
             </w:r>
             <w:r>
               <w:rPr>
@@ -2142,7 +2142,7 @@
               <w:lang w:eastAsia="en-ID"/>
             </w:rPr>
           </w:pPr>
-          <w:hyperlink w:anchor="_Toc234532616" w:history="1">
+          <w:hyperlink w:anchor="_Toc235049364" w:history="1">
             <w:r>
               <w:rPr>
                 <w:rStyle w:val="Hyperlink"/>
@@ -2184,7 +2184,7 @@
                 <w:noProof/>
                 <w:webHidden/>
               </w:rPr>
-              <w:instrText xml:space="preserve"> PAGEREF _Toc234532616 \h </w:instrText>
+              <w:instrText xml:space="preserve"> PAGEREF _Toc235049364 \h </w:instrText>
             </w:r>
             <w:r>
               <w:rPr>
@@ -2228,7 +2228,7 @@
               <w:lang w:eastAsia="en-ID"/>
             </w:rPr>
           </w:pPr>
-          <w:hyperlink w:anchor="_Toc234532617" w:history="1">
+          <w:hyperlink w:anchor="_Toc235049365" w:history="1">
             <w:r>
               <w:rPr>
                 <w:rStyle w:val="Hyperlink"/>
@@ -2270,7 +2270,7 @@
                 <w:noProof/>
                 <w:webHidden/>
               </w:rPr>
-              <w:instrText xml:space="preserve"> PAGEREF _Toc234532617 \h </w:instrText>
+              <w:instrText xml:space="preserve"> PAGEREF _Toc235049365 \h </w:instrText>
             </w:r>
             <w:r>
               <w:rPr>
@@ -2311,7 +2311,7 @@
               <w:lang w:eastAsia="en-ID"/>
             </w:rPr>
           </w:pPr>
-          <w:hyperlink w:anchor="_Toc234532618" w:history="1">
+          <w:hyperlink w:anchor="_Toc235049366" w:history="1">
             <w:r>
               <w:rPr>
                 <w:rStyle w:val="Hyperlink"/>
@@ -2334,7 +2334,7 @@
               <w:rPr>
                 <w:webHidden/>
               </w:rPr>
-              <w:instrText xml:space="preserve"> PAGEREF _Toc234532618 \h </w:instrText>
+              <w:instrText xml:space="preserve"> PAGEREF _Toc235049366 \h </w:instrText>
             </w:r>
             <w:r>
               <w:rPr>
@@ -2374,7 +2374,7 @@
               <w:lang w:eastAsia="en-ID"/>
             </w:rPr>
           </w:pPr>
-          <w:hyperlink w:anchor="_Toc234532619" w:history="1">
+          <w:hyperlink w:anchor="_Toc235049367" w:history="1">
             <w:r>
               <w:rPr>
                 <w:rStyle w:val="Hyperlink"/>
@@ -2416,7 +2416,7 @@
                 <w:noProof/>
                 <w:webHidden/>
               </w:rPr>
-              <w:instrText xml:space="preserve"> PAGEREF _Toc234532619 \h </w:instrText>
+              <w:instrText xml:space="preserve"> PAGEREF _Toc235049367 \h </w:instrText>
             </w:r>
             <w:r>
               <w:rPr>
@@ -2460,7 +2460,7 @@
               <w:lang w:eastAsia="en-ID"/>
             </w:rPr>
           </w:pPr>
-          <w:hyperlink w:anchor="_Toc234532620" w:history="1">
+          <w:hyperlink w:anchor="_Toc235049368" w:history="1">
             <w:r>
               <w:rPr>
                 <w:rStyle w:val="Hyperlink"/>
@@ -2502,7 +2502,7 @@
                 <w:noProof/>
                 <w:webHidden/>
               </w:rPr>
-              <w:instrText xml:space="preserve"> PAGEREF _Toc234532620 \h </w:instrText>
+              <w:instrText xml:space="preserve"> PAGEREF _Toc235049368 \h </w:instrText>
             </w:r>
             <w:r>
               <w:rPr>
@@ -2546,7 +2546,7 @@
               <w:lang w:eastAsia="en-ID"/>
             </w:rPr>
           </w:pPr>
-          <w:hyperlink w:anchor="_Toc234532621" w:history="1">
+          <w:hyperlink w:anchor="_Toc235049369" w:history="1">
             <w:r>
               <w:rPr>
                 <w:rStyle w:val="Hyperlink"/>
@@ -2588,7 +2588,7 @@
                 <w:noProof/>
                 <w:webHidden/>
               </w:rPr>
-              <w:instrText xml:space="preserve"> PAGEREF _Toc234532621 \h </w:instrText>
+              <w:instrText xml:space="preserve"> PAGEREF _Toc235049369 \h </w:instrText>
             </w:r>
             <w:r>
               <w:rPr>
@@ -2632,7 +2632,7 @@
               <w:lang w:eastAsia="en-ID"/>
             </w:rPr>
           </w:pPr>
-          <w:hyperlink w:anchor="_Toc234532622" w:history="1">
+          <w:hyperlink w:anchor="_Toc235049370" w:history="1">
             <w:r>
               <w:rPr>
                 <w:rStyle w:val="Hyperlink"/>
@@ -2674,7 +2674,7 @@
                 <w:noProof/>
                 <w:webHidden/>
               </w:rPr>
-              <w:instrText xml:space="preserve"> PAGEREF _Toc234532622 \h </w:instrText>
+              <w:instrText xml:space="preserve"> PAGEREF _Toc235049370 \h </w:instrText>
             </w:r>
             <w:r>
               <w:rPr>
@@ -2718,7 +2718,7 @@
               <w:lang w:eastAsia="en-ID"/>
             </w:rPr>
           </w:pPr>
-          <w:hyperlink w:anchor="_Toc234532623" w:history="1">
+          <w:hyperlink w:anchor="_Toc235049371" w:history="1">
             <w:r>
               <w:rPr>
                 <w:rStyle w:val="Hyperlink"/>
@@ -2760,7 +2760,7 @@
                 <w:noProof/>
                 <w:webHidden/>
               </w:rPr>
-              <w:instrText xml:space="preserve"> PAGEREF _Toc234532623 \h </w:instrText>
+              <w:instrText xml:space="preserve"> PAGEREF _Toc235049371 \h </w:instrText>
             </w:r>
             <w:r>
               <w:rPr>
@@ -2780,7 +2780,7 @@
                 <w:noProof/>
                 <w:webHidden/>
               </w:rPr>
-              <w:t>31</w:t>
+              <w:t>32</w:t>
             </w:r>
             <w:r>
               <w:rPr>
@@ -2804,7 +2804,7 @@
               <w:lang w:eastAsia="en-ID"/>
             </w:rPr>
           </w:pPr>
-          <w:hyperlink w:anchor="_Toc234532624" w:history="1">
+          <w:hyperlink w:anchor="_Toc235049372" w:history="1">
             <w:r>
               <w:rPr>
                 <w:rStyle w:val="Hyperlink"/>
@@ -2846,7 +2846,7 @@
                 <w:noProof/>
                 <w:webHidden/>
               </w:rPr>
-              <w:instrText xml:space="preserve"> PAGEREF _Toc234532624 \h </w:instrText>
+              <w:instrText xml:space="preserve"> PAGEREF _Toc235049372 \h </w:instrText>
             </w:r>
             <w:r>
               <w:rPr>
@@ -2866,7 +2866,7 @@
                 <w:noProof/>
                 <w:webHidden/>
               </w:rPr>
-              <w:t>31</w:t>
+              <w:t>33</w:t>
             </w:r>
             <w:r>
               <w:rPr>
@@ -2890,7 +2890,7 @@
               <w:lang w:eastAsia="en-ID"/>
             </w:rPr>
           </w:pPr>
-          <w:hyperlink w:anchor="_Toc234532625" w:history="1">
+          <w:hyperlink w:anchor="_Toc235049373" w:history="1">
             <w:r>
               <w:rPr>
                 <w:rStyle w:val="Hyperlink"/>
@@ -2932,7 +2932,7 @@
                 <w:noProof/>
                 <w:webHidden/>
               </w:rPr>
-              <w:instrText xml:space="preserve"> PAGEREF _Toc234532625 \h </w:instrText>
+              <w:instrText xml:space="preserve"> PAGEREF _Toc235049373 \h </w:instrText>
             </w:r>
             <w:r>
               <w:rPr>
@@ -2952,7 +2952,7 @@
                 <w:noProof/>
                 <w:webHidden/>
               </w:rPr>
-              <w:t>31</w:t>
+              <w:t>34</w:t>
             </w:r>
             <w:r>
               <w:rPr>
@@ -3001,7 +3001,7 @@
       <w:pPr>
         <w:pStyle w:val="Heading1"/>
       </w:pPr>
-      <w:bookmarkStart w:id="2" w:name="_Toc234532595"/>
+      <w:bookmarkStart w:id="2" w:name="_Toc235049343"/>
       <w:r>
         <w:lastRenderedPageBreak/>
         <w:t>BAB I</w:t>
@@ -3024,7 +3024,7 @@
         </w:numPr>
         <w:ind w:left="540" w:hanging="630"/>
       </w:pPr>
-      <w:bookmarkStart w:id="3" w:name="_Toc234532596"/>
+      <w:bookmarkStart w:id="3" w:name="_Toc235049344"/>
       <w:r>
         <w:t>Pendahuluan</w:t>
       </w:r>
@@ -3088,7 +3088,7 @@
         </w:numPr>
         <w:ind w:left="450" w:hanging="450"/>
       </w:pPr>
-      <w:bookmarkStart w:id="4" w:name="_Toc234532597"/>
+      <w:bookmarkStart w:id="4" w:name="_Toc235049345"/>
       <w:r>
         <w:t>Variabel (let dan const)</w:t>
       </w:r>
@@ -3697,7 +3697,7 @@
         </w:numPr>
         <w:ind w:left="450" w:hanging="450"/>
       </w:pPr>
-      <w:bookmarkStart w:id="5" w:name="_Toc234532598"/>
+      <w:bookmarkStart w:id="5" w:name="_Toc235049346"/>
       <w:r>
         <w:lastRenderedPageBreak/>
         <w:t>Arrow Function</w:t>
@@ -4190,7 +4190,7 @@
         </w:numPr>
         <w:ind w:left="450" w:hanging="450"/>
       </w:pPr>
-      <w:bookmarkStart w:id="6" w:name="_Toc234532599"/>
+      <w:bookmarkStart w:id="6" w:name="_Toc235049347"/>
       <w:r>
         <w:lastRenderedPageBreak/>
         <w:t>Template Literals</w:t>
@@ -4437,7 +4437,7 @@
         </w:numPr>
         <w:ind w:left="450" w:hanging="450"/>
       </w:pPr>
-      <w:bookmarkStart w:id="7" w:name="_Toc234532600"/>
+      <w:bookmarkStart w:id="7" w:name="_Toc235049348"/>
       <w:r>
         <w:lastRenderedPageBreak/>
         <w:t>Destructuring Assignment</w:t>
@@ -4887,7 +4887,7 @@
       <w:r>
         <w:br w:type="page"/>
       </w:r>
-      <w:bookmarkStart w:id="8" w:name="_Toc234532601"/>
+      <w:bookmarkStart w:id="8" w:name="_Toc235049349"/>
       <w:r>
         <w:lastRenderedPageBreak/>
         <w:t>Spread dan Rest Operator</w:t>
@@ -5207,7 +5207,7 @@
         </w:numPr>
         <w:ind w:left="450" w:hanging="450"/>
       </w:pPr>
-      <w:bookmarkStart w:id="9" w:name="_Toc234532602"/>
+      <w:bookmarkStart w:id="9" w:name="_Toc235049350"/>
       <w:r>
         <w:lastRenderedPageBreak/>
         <w:t>Ringkasan Bab</w:t>
@@ -5328,7 +5328,7 @@
       <w:pPr>
         <w:pStyle w:val="Heading1"/>
       </w:pPr>
-      <w:bookmarkStart w:id="10" w:name="_Toc234532603"/>
+      <w:bookmarkStart w:id="10" w:name="_Toc235049351"/>
       <w:r>
         <w:lastRenderedPageBreak/>
         <w:t>BAB 2</w:t>
@@ -5349,7 +5349,7 @@
         </w:numPr>
         <w:ind w:left="450" w:hanging="450"/>
       </w:pPr>
-      <w:bookmarkStart w:id="11" w:name="_Toc234532604"/>
+      <w:bookmarkStart w:id="11" w:name="_Toc235049352"/>
       <w:r>
         <w:t>Pendahuluan</w:t>
       </w:r>
@@ -5421,7 +5421,7 @@
         </w:numPr>
         <w:ind w:left="450" w:hanging="450"/>
       </w:pPr>
-      <w:bookmarkStart w:id="12" w:name="_Toc234532605"/>
+      <w:bookmarkStart w:id="12" w:name="_Toc235049353"/>
       <w:r>
         <w:t>Node.js</w:t>
       </w:r>
@@ -5916,7 +5916,7 @@
         </w:numPr>
         <w:ind w:left="426"/>
       </w:pPr>
-      <w:bookmarkStart w:id="13" w:name="_Toc234532606"/>
+      <w:bookmarkStart w:id="13" w:name="_Toc235049354"/>
       <w:r>
         <w:t>Pengenalan npm (Node Package Manager)</w:t>
       </w:r>
@@ -6755,7 +6755,7 @@
         </w:numPr>
         <w:ind w:left="426"/>
       </w:pPr>
-      <w:bookmarkStart w:id="14" w:name="_Toc234532607"/>
+      <w:bookmarkStart w:id="14" w:name="_Toc235049355"/>
       <w:r>
         <w:t>Pengenalan pnpm</w:t>
       </w:r>
@@ -7186,7 +7186,7 @@
         </w:numPr>
         <w:ind w:left="426"/>
       </w:pPr>
-      <w:bookmarkStart w:id="15" w:name="_Toc234532608"/>
+      <w:bookmarkStart w:id="15" w:name="_Toc235049356"/>
       <w:r>
         <w:lastRenderedPageBreak/>
         <w:t>Membuat dan Mengelola Project</w:t>
@@ -7664,7 +7664,7 @@
         </w:numPr>
         <w:ind w:left="426"/>
       </w:pPr>
-      <w:bookmarkStart w:id="16" w:name="_Toc234532609"/>
+      <w:bookmarkStart w:id="16" w:name="_Toc235049357"/>
       <w:r>
         <w:t>Ringkasan Bab</w:t>
       </w:r>
@@ -7733,7 +7733,7 @@
       <w:r>
         <w:br w:type="page"/>
       </w:r>
-      <w:bookmarkStart w:id="17" w:name="_Toc234532610"/>
+      <w:bookmarkStart w:id="17" w:name="_Toc235049358"/>
       <w:r>
         <w:lastRenderedPageBreak/>
         <w:t xml:space="preserve">BAB 3 </w:t>
@@ -7754,7 +7754,7 @@
         </w:numPr>
         <w:ind w:left="426"/>
       </w:pPr>
-      <w:bookmarkStart w:id="18" w:name="_Toc234532611"/>
+      <w:bookmarkStart w:id="18" w:name="_Toc235049359"/>
       <w:r>
         <w:t>Pendahuluan</w:t>
       </w:r>
@@ -7843,7 +7843,7 @@
         </w:numPr>
         <w:ind w:left="426"/>
       </w:pPr>
-      <w:bookmarkStart w:id="19" w:name="_Toc234532612"/>
+      <w:bookmarkStart w:id="19" w:name="_Toc235049360"/>
       <w:r>
         <w:t>Mengenal Vite</w:t>
       </w:r>
@@ -7971,7 +7971,7 @@
         </w:numPr>
         <w:ind w:left="426"/>
       </w:pPr>
-      <w:bookmarkStart w:id="20" w:name="_Toc234532613"/>
+      <w:bookmarkStart w:id="20" w:name="_Toc235049361"/>
       <w:r>
         <w:t>Membuat Project</w:t>
       </w:r>
@@ -8321,7 +8321,7 @@
         </w:numPr>
         <w:ind w:left="426"/>
       </w:pPr>
-      <w:bookmarkStart w:id="21" w:name="_Toc234532614"/>
+      <w:bookmarkStart w:id="21" w:name="_Toc235049362"/>
       <w:r>
         <w:t>Struktur Folder Project</w:t>
       </w:r>
@@ -8629,7 +8629,7 @@
         </w:numPr>
         <w:ind w:left="426"/>
       </w:pPr>
-      <w:bookmarkStart w:id="22" w:name="_Toc234532615"/>
+      <w:bookmarkStart w:id="22" w:name="_Toc235049363"/>
       <w:r>
         <w:t>Mengenal File package.json</w:t>
       </w:r>
@@ -8878,7 +8878,7 @@
         </w:numPr>
         <w:ind w:left="426"/>
       </w:pPr>
-      <w:bookmarkStart w:id="23" w:name="_Toc234532616"/>
+      <w:bookmarkStart w:id="23" w:name="_Toc235049364"/>
       <w:r>
         <w:lastRenderedPageBreak/>
         <w:t>Perintah Dasar pnpm</w:t>
@@ -9157,7 +9157,7 @@
         </w:numPr>
         <w:ind w:left="426"/>
       </w:pPr>
-      <w:bookmarkStart w:id="24" w:name="_Toc234532617"/>
+      <w:bookmarkStart w:id="24" w:name="_Toc235049365"/>
       <w:r>
         <w:t>Ringkasan Bab</w:t>
       </w:r>
@@ -9194,7 +9194,7 @@
       <w:pPr>
         <w:pStyle w:val="Heading1"/>
       </w:pPr>
-      <w:bookmarkStart w:id="25" w:name="_Toc234532618"/>
+      <w:bookmarkStart w:id="25" w:name="_Toc235049366"/>
       <w:r>
         <w:lastRenderedPageBreak/>
         <w:t xml:space="preserve">BAB 4 </w:t>
@@ -9217,7 +9217,7 @@
         </w:numPr>
         <w:ind w:left="426"/>
       </w:pPr>
-      <w:bookmarkStart w:id="26" w:name="_Toc234532619"/>
+      <w:bookmarkStart w:id="26" w:name="_Toc235049367"/>
       <w:r>
         <w:t>Pendahuluan</w:t>
       </w:r>
@@ -9249,7 +9249,7 @@
         </w:numPr>
         <w:ind w:left="426"/>
       </w:pPr>
-      <w:bookmarkStart w:id="27" w:name="_Toc234532620"/>
+      <w:bookmarkStart w:id="27" w:name="_Toc235049368"/>
       <w:r>
         <w:t>Apa itu React?</w:t>
       </w:r>
@@ -9362,7 +9362,7 @@
         </w:numPr>
         <w:ind w:left="426"/>
       </w:pPr>
-      <w:bookmarkStart w:id="28" w:name="_Toc234532621"/>
+      <w:bookmarkStart w:id="28" w:name="_Toc235049369"/>
       <w:r>
         <w:t>Mengenal JSX</w:t>
       </w:r>
@@ -9870,11 +9870,26 @@
         </w:numPr>
         <w:ind w:left="426"/>
       </w:pPr>
-      <w:bookmarkStart w:id="29" w:name="_Toc234532622"/>
+      <w:bookmarkStart w:id="29" w:name="_Toc235049370"/>
       <w:r>
         <w:t>Mengenal Komponen</w:t>
       </w:r>
       <w:bookmarkEnd w:id="29"/>
+    </w:p>
+    <w:p>
+      <w:pPr>
+        <w:rPr>
+          <w:b/>
+          <w:bCs/>
+        </w:rPr>
+      </w:pPr>
+      <w:r>
+        <w:rPr>
+          <w:b/>
+          <w:bCs/>
+        </w:rPr>
+        <w:t>Pengertian Komponen</w:t>
+      </w:r>
     </w:p>
     <w:p>
       <w:pPr>
@@ -9948,6 +9963,125 @@
         <w:t>Keempat bagian tersebut akan dibuat menjadi komponen yang terpisah.</w:t>
       </w:r>
     </w:p>
+    <w:p>
+      <w:pPr>
+        <w:rPr>
+          <w:b/>
+          <w:bCs/>
+        </w:rPr>
+      </w:pPr>
+      <w:r>
+        <w:rPr>
+          <w:b/>
+          <w:bCs/>
+        </w:rPr>
+        <w:t>Functional Component</w:t>
+      </w:r>
+    </w:p>
+    <w:p>
+      <w:r>
+        <w:t>Pada React modern, komponen dibuat menggunakan Function.</w:t>
+      </w:r>
+    </w:p>
+    <w:p>
+      <w:r>
+        <w:rPr>
+          <w:noProof/>
+        </w:rPr>
+        <w:lastRenderedPageBreak/>
+        <w:drawing>
+          <wp:inline distT="0" distB="0" distL="0" distR="0" wp14:anchorId="32D80AF5" wp14:editId="252914B9">
+            <wp:extent cx="4086795" cy="2010056"/>
+            <wp:effectExtent l="0" t="0" r="0" b="9525"/>
+            <wp:docPr id="352766328" name="Picture 1"/>
+            <wp:cNvGraphicFramePr>
+              <a:graphicFrameLocks xmlns:a="http://schemas.openxmlformats.org/drawingml/2006/main" noChangeAspect="1"/>
+            </wp:cNvGraphicFramePr>
+            <a:graphic xmlns:a="http://schemas.openxmlformats.org/drawingml/2006/main">
+              <a:graphicData uri="http://schemas.openxmlformats.org/drawingml/2006/picture">
+                <pic:pic xmlns:pic="http://schemas.openxmlformats.org/drawingml/2006/picture">
+                  <pic:nvPicPr>
+                    <pic:cNvPr id="352766328" name=""/>
+                    <pic:cNvPicPr/>
+                  </pic:nvPicPr>
+                  <pic:blipFill>
+                    <a:blip r:embed="rId78"/>
+                    <a:stretch>
+                      <a:fillRect/>
+                    </a:stretch>
+                  </pic:blipFill>
+                  <pic:spPr>
+                    <a:xfrm>
+                      <a:off x="0" y="0"/>
+                      <a:ext cx="4086795" cy="2010056"/>
+                    </a:xfrm>
+                    <a:prstGeom prst="rect">
+                      <a:avLst/>
+                    </a:prstGeom>
+                  </pic:spPr>
+                </pic:pic>
+              </a:graphicData>
+            </a:graphic>
+          </wp:inline>
+        </w:drawing>
+      </w:r>
+    </w:p>
+    <w:p>
+      <w:pPr>
+        <w:ind w:firstLine="720"/>
+      </w:pPr>
+      <w:r>
+        <w:t>Selain menggunakan function biasa, komponen juga dapat dibuat menggunakan Arrow Function.</w:t>
+      </w:r>
+    </w:p>
+    <w:p>
+      <w:r>
+        <w:rPr>
+          <w:noProof/>
+        </w:rPr>
+        <w:drawing>
+          <wp:inline distT="0" distB="0" distL="0" distR="0" wp14:anchorId="526C1770" wp14:editId="17CBF729">
+            <wp:extent cx="4058216" cy="2000529"/>
+            <wp:effectExtent l="0" t="0" r="0" b="0"/>
+            <wp:docPr id="189516816" name="Picture 1"/>
+            <wp:cNvGraphicFramePr>
+              <a:graphicFrameLocks xmlns:a="http://schemas.openxmlformats.org/drawingml/2006/main" noChangeAspect="1"/>
+            </wp:cNvGraphicFramePr>
+            <a:graphic xmlns:a="http://schemas.openxmlformats.org/drawingml/2006/main">
+              <a:graphicData uri="http://schemas.openxmlformats.org/drawingml/2006/picture">
+                <pic:pic xmlns:pic="http://schemas.openxmlformats.org/drawingml/2006/picture">
+                  <pic:nvPicPr>
+                    <pic:cNvPr id="189516816" name=""/>
+                    <pic:cNvPicPr/>
+                  </pic:nvPicPr>
+                  <pic:blipFill>
+                    <a:blip r:embed="rId79"/>
+                    <a:stretch>
+                      <a:fillRect/>
+                    </a:stretch>
+                  </pic:blipFill>
+                  <pic:spPr>
+                    <a:xfrm>
+                      <a:off x="0" y="0"/>
+                      <a:ext cx="4058216" cy="2000529"/>
+                    </a:xfrm>
+                    <a:prstGeom prst="rect">
+                      <a:avLst/>
+                    </a:prstGeom>
+                  </pic:spPr>
+                </pic:pic>
+              </a:graphicData>
+            </a:graphic>
+          </wp:inline>
+        </w:drawing>
+      </w:r>
+    </w:p>
+    <w:p>
+      <w:r>
+        <w:t>Cara kedua merupakan cara yang paling sering digunakan pada React modern.</w:t>
+      </w:r>
+    </w:p>
+    <w:p/>
     <w:p>
       <w:pPr>
         <w:pStyle w:val="Heading2"/>
@@ -9957,12 +10091,117 @@
         </w:numPr>
         <w:ind w:left="426"/>
       </w:pPr>
-      <w:bookmarkStart w:id="30" w:name="_Toc234532623"/>
+      <w:bookmarkStart w:id="30" w:name="_Toc235049371"/>
       <w:r>
         <w:t>Membuat Komponen Pertama</w:t>
       </w:r>
       <w:bookmarkEnd w:id="30"/>
     </w:p>
+    <w:p>
+      <w:r>
+        <w:t>Pada folder src, buat folder baru bernama</w:t>
+      </w:r>
+      <w:r>
+        <w:t xml:space="preserve"> components, k</w:t>
+      </w:r>
+      <w:r>
+        <w:t>emudian buat file</w:t>
+      </w:r>
+      <w:r>
+        <w:t xml:space="preserve"> Header.jsx</w:t>
+      </w:r>
+    </w:p>
+    <w:p>
+      <w:r>
+        <w:rPr>
+          <w:noProof/>
+        </w:rPr>
+        <w:drawing>
+          <wp:inline distT="0" distB="0" distL="0" distR="0" wp14:anchorId="1665D710" wp14:editId="5BF830C4">
+            <wp:extent cx="2572109" cy="990738"/>
+            <wp:effectExtent l="0" t="0" r="0" b="0"/>
+            <wp:docPr id="175788295" name="Picture 1"/>
+            <wp:cNvGraphicFramePr>
+              <a:graphicFrameLocks xmlns:a="http://schemas.openxmlformats.org/drawingml/2006/main" noChangeAspect="1"/>
+            </wp:cNvGraphicFramePr>
+            <a:graphic xmlns:a="http://schemas.openxmlformats.org/drawingml/2006/main">
+              <a:graphicData uri="http://schemas.openxmlformats.org/drawingml/2006/picture">
+                <pic:pic xmlns:pic="http://schemas.openxmlformats.org/drawingml/2006/picture">
+                  <pic:nvPicPr>
+                    <pic:cNvPr id="175788295" name=""/>
+                    <pic:cNvPicPr/>
+                  </pic:nvPicPr>
+                  <pic:blipFill>
+                    <a:blip r:embed="rId80"/>
+                    <a:stretch>
+                      <a:fillRect/>
+                    </a:stretch>
+                  </pic:blipFill>
+                  <pic:spPr>
+                    <a:xfrm>
+                      <a:off x="0" y="0"/>
+                      <a:ext cx="2572109" cy="990738"/>
+                    </a:xfrm>
+                    <a:prstGeom prst="rect">
+                      <a:avLst/>
+                    </a:prstGeom>
+                  </pic:spPr>
+                </pic:pic>
+              </a:graphicData>
+            </a:graphic>
+          </wp:inline>
+        </w:drawing>
+      </w:r>
+    </w:p>
+    <w:p>
+      <w:r>
+        <w:t>Isi file tersebut:</w:t>
+      </w:r>
+    </w:p>
+    <w:p>
+      <w:r>
+        <w:rPr>
+          <w:noProof/>
+        </w:rPr>
+        <w:lastRenderedPageBreak/>
+        <w:drawing>
+          <wp:inline distT="0" distB="0" distL="0" distR="0" wp14:anchorId="4CA8793D" wp14:editId="763FF1CC">
+            <wp:extent cx="4525006" cy="2543530"/>
+            <wp:effectExtent l="0" t="0" r="0" b="9525"/>
+            <wp:docPr id="209278020" name="Picture 1"/>
+            <wp:cNvGraphicFramePr>
+              <a:graphicFrameLocks xmlns:a="http://schemas.openxmlformats.org/drawingml/2006/main" noChangeAspect="1"/>
+            </wp:cNvGraphicFramePr>
+            <a:graphic xmlns:a="http://schemas.openxmlformats.org/drawingml/2006/main">
+              <a:graphicData uri="http://schemas.openxmlformats.org/drawingml/2006/picture">
+                <pic:pic xmlns:pic="http://schemas.openxmlformats.org/drawingml/2006/picture">
+                  <pic:nvPicPr>
+                    <pic:cNvPr id="209278020" name=""/>
+                    <pic:cNvPicPr/>
+                  </pic:nvPicPr>
+                  <pic:blipFill>
+                    <a:blip r:embed="rId81"/>
+                    <a:stretch>
+                      <a:fillRect/>
+                    </a:stretch>
+                  </pic:blipFill>
+                  <pic:spPr>
+                    <a:xfrm>
+                      <a:off x="0" y="0"/>
+                      <a:ext cx="4525006" cy="2543530"/>
+                    </a:xfrm>
+                    <a:prstGeom prst="rect">
+                      <a:avLst/>
+                    </a:prstGeom>
+                  </pic:spPr>
+                </pic:pic>
+              </a:graphicData>
+            </a:graphic>
+          </wp:inline>
+        </w:drawing>
+      </w:r>
+    </w:p>
+    <w:p/>
     <w:p>
       <w:pPr>
         <w:pStyle w:val="Heading2"/>
@@ -9972,12 +10211,107 @@
         </w:numPr>
         <w:ind w:left="426"/>
       </w:pPr>
-      <w:bookmarkStart w:id="31" w:name="_Toc234532624"/>
+      <w:bookmarkStart w:id="31" w:name="_Toc235049372"/>
       <w:r>
         <w:t>Menggunakan Komponen</w:t>
       </w:r>
       <w:bookmarkEnd w:id="31"/>
     </w:p>
+    <w:p>
+      <w:r>
+        <w:t>Setelah komponen dibuat, langkah berikutnya adalah menggunakannya pada App.jsx.</w:t>
+      </w:r>
+    </w:p>
+    <w:p>
+      <w:r>
+        <w:rPr>
+          <w:noProof/>
+        </w:rPr>
+        <w:drawing>
+          <wp:inline distT="0" distB="0" distL="0" distR="0" wp14:anchorId="4A583FAE" wp14:editId="368FD3DF">
+            <wp:extent cx="4429743" cy="2724530"/>
+            <wp:effectExtent l="0" t="0" r="9525" b="0"/>
+            <wp:docPr id="385417071" name="Picture 1"/>
+            <wp:cNvGraphicFramePr>
+              <a:graphicFrameLocks xmlns:a="http://schemas.openxmlformats.org/drawingml/2006/main" noChangeAspect="1"/>
+            </wp:cNvGraphicFramePr>
+            <a:graphic xmlns:a="http://schemas.openxmlformats.org/drawingml/2006/main">
+              <a:graphicData uri="http://schemas.openxmlformats.org/drawingml/2006/picture">
+                <pic:pic xmlns:pic="http://schemas.openxmlformats.org/drawingml/2006/picture">
+                  <pic:nvPicPr>
+                    <pic:cNvPr id="385417071" name=""/>
+                    <pic:cNvPicPr/>
+                  </pic:nvPicPr>
+                  <pic:blipFill>
+                    <a:blip r:embed="rId82"/>
+                    <a:stretch>
+                      <a:fillRect/>
+                    </a:stretch>
+                  </pic:blipFill>
+                  <pic:spPr>
+                    <a:xfrm>
+                      <a:off x="0" y="0"/>
+                      <a:ext cx="4429743" cy="2724530"/>
+                    </a:xfrm>
+                    <a:prstGeom prst="rect">
+                      <a:avLst/>
+                    </a:prstGeom>
+                  </pic:spPr>
+                </pic:pic>
+              </a:graphicData>
+            </a:graphic>
+          </wp:inline>
+        </w:drawing>
+      </w:r>
+    </w:p>
+    <w:p>
+      <w:r>
+        <w:t>Ketika aplikasi dijalankan, maka akan muncul:</w:t>
+      </w:r>
+    </w:p>
+    <w:p>
+      <w:r>
+        <w:rPr>
+          <w:noProof/>
+        </w:rPr>
+        <w:drawing>
+          <wp:inline distT="0" distB="0" distL="0" distR="0" wp14:anchorId="040B091D" wp14:editId="04EE0C63">
+            <wp:extent cx="5731510" cy="1021080"/>
+            <wp:effectExtent l="0" t="0" r="2540" b="7620"/>
+            <wp:docPr id="1883950824" name="Picture 1"/>
+            <wp:cNvGraphicFramePr>
+              <a:graphicFrameLocks xmlns:a="http://schemas.openxmlformats.org/drawingml/2006/main" noChangeAspect="1"/>
+            </wp:cNvGraphicFramePr>
+            <a:graphic xmlns:a="http://schemas.openxmlformats.org/drawingml/2006/main">
+              <a:graphicData uri="http://schemas.openxmlformats.org/drawingml/2006/picture">
+                <pic:pic xmlns:pic="http://schemas.openxmlformats.org/drawingml/2006/picture">
+                  <pic:nvPicPr>
+                    <pic:cNvPr id="1883950824" name=""/>
+                    <pic:cNvPicPr/>
+                  </pic:nvPicPr>
+                  <pic:blipFill>
+                    <a:blip r:embed="rId83"/>
+                    <a:stretch>
+                      <a:fillRect/>
+                    </a:stretch>
+                  </pic:blipFill>
+                  <pic:spPr>
+                    <a:xfrm>
+                      <a:off x="0" y="0"/>
+                      <a:ext cx="5731510" cy="1021080"/>
+                    </a:xfrm>
+                    <a:prstGeom prst="rect">
+                      <a:avLst/>
+                    </a:prstGeom>
+                  </pic:spPr>
+                </pic:pic>
+              </a:graphicData>
+            </a:graphic>
+          </wp:inline>
+        </w:drawing>
+      </w:r>
+    </w:p>
+    <w:p/>
     <w:p>
       <w:pPr>
         <w:pStyle w:val="Heading2"/>
@@ -9987,15 +10321,32 @@
         </w:numPr>
         <w:ind w:left="426"/>
       </w:pPr>
-      <w:bookmarkStart w:id="32" w:name="_Toc234532625"/>
-      <w:r>
+      <w:bookmarkStart w:id="32" w:name="_Toc235049373"/>
+      <w:r>
+        <w:lastRenderedPageBreak/>
         <w:t>Ringkasan Bab</w:t>
       </w:r>
       <w:bookmarkEnd w:id="32"/>
     </w:p>
+    <w:p>
+      <w:pPr>
+        <w:ind w:firstLine="426"/>
+      </w:pPr>
+      <w:r>
+        <w:t>Pada bab ini peserta telah mempelajari konsep dasar React, mengenal JSX sebagai sintaks untuk membangun antarmuka pengguna, serta memahami bagaimana aplikasi React disusun menggunakan Functional Component. Peserta juga telah berhasil membuat beberapa komponen sederhana dan menyusunnya menjadi tampilan awal aplikasi CareerHub.</w:t>
+      </w:r>
+    </w:p>
+    <w:p>
+      <w:pPr>
+        <w:ind w:firstLine="426"/>
+      </w:pPr>
+      <w:r>
+        <w:t>Struktur komponen yang dibuat pada bab ini akan menjadi fondasi pengembangan aplikasi pada bab-bab selanjutnya. Pada Bab 5, peserta akan mempelajari Props, sehingga komponen JobCard tidak lagi menampilkan data statis, melainkan menerima data secara dinamis dari komponen induknya. Dengan demikian, aplikasi CareerHub akan mulai menampilkan daftar lowongan pekerjaan yang lebih fleksibel dan mudah dikelola.</w:t>
+      </w:r>
+    </w:p>
     <w:sectPr>
-      <w:headerReference w:type="default" r:id="rId78"/>
-      <w:footerReference w:type="default" r:id="rId79"/>
+      <w:headerReference w:type="default" r:id="rId84"/>
+      <w:footerReference w:type="default" r:id="rId85"/>
       <w:pgSz w:w="11906" w:h="16838"/>
       <w:pgMar w:top="1440" w:right="1440" w:bottom="1440" w:left="1440" w:header="708" w:footer="708" w:gutter="0"/>
       <w:pgNumType w:start="1"/>
@@ -10255,6 +10606,119 @@
 <file path=word/numbering.xml><?xml version="1.0" encoding="utf-8"?>
 <w:numbering xmlns:wpc="http://schemas.microsoft.com/office/word/2010/wordprocessingCanvas" xmlns:cx="http://schemas.microsoft.com/office/drawing/2014/chartex" xmlns:cx1="http://schemas.microsoft.com/office/drawing/2015/9/8/chartex" xmlns:cx2="http://schemas.microsoft.com/office/drawing/2015/10/21/chartex" xmlns:cx3="http://schemas.microsoft.com/office/drawing/2016/5/9/chartex" xmlns:cx4="http://schemas.microsoft.com/office/drawing/2016/5/10/chartex" xmlns:cx5="http://schemas.microsoft.com/office/drawing/2016/5/11/chartex" xmlns:cx6="http://schemas.microsoft.com/office/drawing/2016/5/12/chartex" xmlns:cx7="http://schemas.microsoft.com/office/drawing/2016/5/13/chartex" xmlns:cx8="http://schemas.microsoft.com/office/drawing/2016/5/14/chartex" xmlns:mc="http://schemas.openxmlformats.org/markup-compatibility/2006" xmlns:aink="http://schemas.microsoft.com/office/drawing/2016/ink" xmlns:am3d="http://schemas.microsoft.com/office/drawing/2017/model3d" xmlns:o="urn:schemas-microsoft-com:office:office" xmlns:oel="http://schemas.microsoft.com/office/2019/extlst" xmlns:r="http://schemas.openxmlformats.org/officeDocument/2006/relationships" xmlns:m="http://schemas.openxmlformats.org/officeDocument/2006/math" xmlns:v="urn:schemas-microsoft-com:vml" xmlns:wp14="http://schemas.microsoft.com/office/word/2010/wordprocessingDrawing" xmlns:wp="http://schemas.openxmlformats.org/drawingml/2006/wordprocessingDrawing" xmlns:w10="urn:schemas-microsoft-com:office:word" xmlns:w="http://schemas.openxmlformats.org/wordprocessingml/2006/main" xmlns:w14="http://schemas.microsoft.com/office/word/2010/wordml" xmlns:w15="http://schemas.microsoft.com/office/word/2012/wordml" xmlns:w16cex="http://schemas.microsoft.com/office/word/2018/wordml/cex" xmlns:w16cid="http://schemas.microsoft.com/office/word/2016/wordml/cid" xmlns:w16="http://schemas.microsoft.com/office/word/2018/wordml" xmlns:w16du="http://schemas.microsoft.com/office/word/2023/wordml/word16du" xmlns:w16sdtdh="http://schemas.microsoft.com/office/word/2020/wordml/sdtdatahash" xmlns:w16sdtfl="http://schemas.microsoft.com/office/word/2024/wordml/sdtformatlock" xmlns:w16se="http://schemas.microsoft.com/office/word/2015/wordml/symex" xmlns:wpg="http://schemas.microsoft.com/office/word/2010/wordprocessingGroup" xmlns:wpi="http://schemas.microsoft.com/office/word/2010/wordprocessingInk" xmlns:wne="http://schemas.microsoft.com/office/word/2006/wordml" xmlns:wps="http://schemas.microsoft.com/office/word/2010/wordprocessingShape" mc:Ignorable="w14 w15 w16se w16cid w16 w16cex w16sdtdh w16sdtfl w16du wp14">
   <w:abstractNum w:abstractNumId="0" w15:restartNumberingAfterBreak="0">
+    <w:nsid w:val="054F5B0B"/>
+    <w:multiLevelType w:val="hybridMultilevel"/>
+    <w:tmpl w:val="DF9E4402"/>
+    <w:lvl w:ilvl="0" w:tplc="38090001">
+      <w:start w:val="1"/>
+      <w:numFmt w:val="bullet"/>
+      <w:lvlText w:val=""/>
+      <w:lvlJc w:val="left"/>
+      <w:pPr>
+        <w:ind w:left="1440" w:hanging="360"/>
+      </w:pPr>
+      <w:rPr>
+        <w:rFonts w:ascii="Symbol" w:hAnsi="Symbol" w:hint="default"/>
+      </w:rPr>
+    </w:lvl>
+    <w:lvl w:ilvl="1" w:tplc="38090003" w:tentative="1">
+      <w:start w:val="1"/>
+      <w:numFmt w:val="bullet"/>
+      <w:lvlText w:val="o"/>
+      <w:lvlJc w:val="left"/>
+      <w:pPr>
+        <w:ind w:left="2160" w:hanging="360"/>
+      </w:pPr>
+      <w:rPr>
+        <w:rFonts w:ascii="Courier New" w:hAnsi="Courier New" w:cs="Courier New" w:hint="default"/>
+      </w:rPr>
+    </w:lvl>
+    <w:lvl w:ilvl="2" w:tplc="38090005" w:tentative="1">
+      <w:start w:val="1"/>
+      <w:numFmt w:val="bullet"/>
+      <w:lvlText w:val=""/>
+      <w:lvlJc w:val="left"/>
+      <w:pPr>
+        <w:ind w:left="2880" w:hanging="360"/>
+      </w:pPr>
+      <w:rPr>
+        <w:rFonts w:ascii="Wingdings" w:hAnsi="Wingdings" w:hint="default"/>
+      </w:rPr>
+    </w:lvl>
+    <w:lvl w:ilvl="3" w:tplc="38090001" w:tentative="1">
+      <w:start w:val="1"/>
+      <w:numFmt w:val="bullet"/>
+      <w:lvlText w:val=""/>
+      <w:lvlJc w:val="left"/>
+      <w:pPr>
+        <w:ind w:left="3600" w:hanging="360"/>
+      </w:pPr>
+      <w:rPr>
+        <w:rFonts w:ascii="Symbol" w:hAnsi="Symbol" w:hint="default"/>
+      </w:rPr>
+    </w:lvl>
+    <w:lvl w:ilvl="4" w:tplc="38090003" w:tentative="1">
+      <w:start w:val="1"/>
+      <w:numFmt w:val="bullet"/>
+      <w:lvlText w:val="o"/>
+      <w:lvlJc w:val="left"/>
+      <w:pPr>
+        <w:ind w:left="4320" w:hanging="360"/>
+      </w:pPr>
+      <w:rPr>
+        <w:rFonts w:ascii="Courier New" w:hAnsi="Courier New" w:cs="Courier New" w:hint="default"/>
+      </w:rPr>
+    </w:lvl>
+    <w:lvl w:ilvl="5" w:tplc="38090005" w:tentative="1">
+      <w:start w:val="1"/>
+      <w:numFmt w:val="bullet"/>
+      <w:lvlText w:val=""/>
+      <w:lvlJc w:val="left"/>
+      <w:pPr>
+        <w:ind w:left="5040" w:hanging="360"/>
+      </w:pPr>
+      <w:rPr>
+        <w:rFonts w:ascii="Wingdings" w:hAnsi="Wingdings" w:hint="default"/>
+      </w:rPr>
+    </w:lvl>
+    <w:lvl w:ilvl="6" w:tplc="38090001" w:tentative="1">
+      <w:start w:val="1"/>
+      <w:numFmt w:val="bullet"/>
+      <w:lvlText w:val=""/>
+      <w:lvlJc w:val="left"/>
+      <w:pPr>
+        <w:ind w:left="5760" w:hanging="360"/>
+      </w:pPr>
+      <w:rPr>
+        <w:rFonts w:ascii="Symbol" w:hAnsi="Symbol" w:hint="default"/>
+      </w:rPr>
+    </w:lvl>
+    <w:lvl w:ilvl="7" w:tplc="38090003" w:tentative="1">
+      <w:start w:val="1"/>
+      <w:numFmt w:val="bullet"/>
+      <w:lvlText w:val="o"/>
+      <w:lvlJc w:val="left"/>
+      <w:pPr>
+        <w:ind w:left="6480" w:hanging="360"/>
+      </w:pPr>
+      <w:rPr>
+        <w:rFonts w:ascii="Courier New" w:hAnsi="Courier New" w:cs="Courier New" w:hint="default"/>
+      </w:rPr>
+    </w:lvl>
+    <w:lvl w:ilvl="8" w:tplc="38090005" w:tentative="1">
+      <w:start w:val="1"/>
+      <w:numFmt w:val="bullet"/>
+      <w:lvlText w:val=""/>
+      <w:lvlJc w:val="left"/>
+      <w:pPr>
+        <w:ind w:left="7200" w:hanging="360"/>
+      </w:pPr>
+      <w:rPr>
+        <w:rFonts w:ascii="Wingdings" w:hAnsi="Wingdings" w:hint="default"/>
+      </w:rPr>
+    </w:lvl>
+  </w:abstractNum>
+  <w:abstractNum w:abstractNumId="1" w15:restartNumberingAfterBreak="0">
     <w:nsid w:val="09123A7C"/>
     <w:multiLevelType w:val="multilevel"/>
     <w:tmpl w:val="7D6AE8C2"/>
@@ -10367,7 +10831,7 @@
       </w:rPr>
     </w:lvl>
   </w:abstractNum>
-  <w:abstractNum w:abstractNumId="1" w15:restartNumberingAfterBreak="0">
+  <w:abstractNum w:abstractNumId="2" w15:restartNumberingAfterBreak="0">
     <w:nsid w:val="1B2053C4"/>
     <w:multiLevelType w:val="multilevel"/>
     <w:tmpl w:val="33887266"/>
@@ -10456,7 +10920,7 @@
       </w:pPr>
     </w:lvl>
   </w:abstractNum>
-  <w:abstractNum w:abstractNumId="2" w15:restartNumberingAfterBreak="0">
+  <w:abstractNum w:abstractNumId="3" w15:restartNumberingAfterBreak="0">
     <w:nsid w:val="1F6E7A5A"/>
     <w:multiLevelType w:val="hybridMultilevel"/>
     <w:tmpl w:val="4E9AF2C0"/>
@@ -10569,7 +11033,7 @@
       </w:rPr>
     </w:lvl>
   </w:abstractNum>
-  <w:abstractNum w:abstractNumId="3" w15:restartNumberingAfterBreak="0">
+  <w:abstractNum w:abstractNumId="4" w15:restartNumberingAfterBreak="0">
     <w:nsid w:val="20272AB3"/>
     <w:multiLevelType w:val="multilevel"/>
     <w:tmpl w:val="3809001F"/>
@@ -10655,7 +11119,7 @@
       </w:pPr>
     </w:lvl>
   </w:abstractNum>
-  <w:abstractNum w:abstractNumId="4" w15:restartNumberingAfterBreak="0">
+  <w:abstractNum w:abstractNumId="5" w15:restartNumberingAfterBreak="0">
     <w:nsid w:val="21CF4586"/>
     <w:multiLevelType w:val="hybridMultilevel"/>
     <w:tmpl w:val="C00AE474"/>
@@ -10768,7 +11232,7 @@
       </w:rPr>
     </w:lvl>
   </w:abstractNum>
-  <w:abstractNum w:abstractNumId="5" w15:restartNumberingAfterBreak="0">
+  <w:abstractNum w:abstractNumId="6" w15:restartNumberingAfterBreak="0">
     <w:nsid w:val="226F47CF"/>
     <w:multiLevelType w:val="multilevel"/>
     <w:tmpl w:val="9934D454"/>
@@ -10881,7 +11345,7 @@
       </w:rPr>
     </w:lvl>
   </w:abstractNum>
-  <w:abstractNum w:abstractNumId="6" w15:restartNumberingAfterBreak="0">
+  <w:abstractNum w:abstractNumId="7" w15:restartNumberingAfterBreak="0">
     <w:nsid w:val="25240D8C"/>
     <w:multiLevelType w:val="multilevel"/>
     <w:tmpl w:val="7D6AE8C2"/>
@@ -10994,7 +11458,7 @@
       </w:rPr>
     </w:lvl>
   </w:abstractNum>
-  <w:abstractNum w:abstractNumId="7" w15:restartNumberingAfterBreak="0">
+  <w:abstractNum w:abstractNumId="8" w15:restartNumberingAfterBreak="0">
     <w:nsid w:val="254623FE"/>
     <w:multiLevelType w:val="hybridMultilevel"/>
     <w:tmpl w:val="15443EF8"/>
@@ -11107,7 +11571,7 @@
       </w:rPr>
     </w:lvl>
   </w:abstractNum>
-  <w:abstractNum w:abstractNumId="8" w15:restartNumberingAfterBreak="0">
+  <w:abstractNum w:abstractNumId="9" w15:restartNumberingAfterBreak="0">
     <w:nsid w:val="28AA3C95"/>
     <w:multiLevelType w:val="hybridMultilevel"/>
     <w:tmpl w:val="9E943A0A"/>
@@ -11220,7 +11684,7 @@
       </w:rPr>
     </w:lvl>
   </w:abstractNum>
-  <w:abstractNum w:abstractNumId="9" w15:restartNumberingAfterBreak="0">
+  <w:abstractNum w:abstractNumId="10" w15:restartNumberingAfterBreak="0">
     <w:nsid w:val="2D0C5139"/>
     <w:multiLevelType w:val="hybridMultilevel"/>
     <w:tmpl w:val="D32A7A6E"/>
@@ -11306,7 +11770,7 @@
       </w:pPr>
     </w:lvl>
   </w:abstractNum>
-  <w:abstractNum w:abstractNumId="10" w15:restartNumberingAfterBreak="0">
+  <w:abstractNum w:abstractNumId="11" w15:restartNumberingAfterBreak="0">
     <w:nsid w:val="348B03D3"/>
     <w:multiLevelType w:val="hybridMultilevel"/>
     <w:tmpl w:val="BAFA88AE"/>
@@ -11419,7 +11883,7 @@
       </w:rPr>
     </w:lvl>
   </w:abstractNum>
-  <w:abstractNum w:abstractNumId="11" w15:restartNumberingAfterBreak="0">
+  <w:abstractNum w:abstractNumId="12" w15:restartNumberingAfterBreak="0">
     <w:nsid w:val="3AD41797"/>
     <w:multiLevelType w:val="hybridMultilevel"/>
     <w:tmpl w:val="7B68EA98"/>
@@ -11505,7 +11969,7 @@
       </w:pPr>
     </w:lvl>
   </w:abstractNum>
-  <w:abstractNum w:abstractNumId="12" w15:restartNumberingAfterBreak="0">
+  <w:abstractNum w:abstractNumId="13" w15:restartNumberingAfterBreak="0">
     <w:nsid w:val="3E8D75DB"/>
     <w:multiLevelType w:val="multilevel"/>
     <w:tmpl w:val="9934D454"/>
@@ -11618,7 +12082,7 @@
       </w:rPr>
     </w:lvl>
   </w:abstractNum>
-  <w:abstractNum w:abstractNumId="13" w15:restartNumberingAfterBreak="0">
+  <w:abstractNum w:abstractNumId="14" w15:restartNumberingAfterBreak="0">
     <w:nsid w:val="3F210C07"/>
     <w:multiLevelType w:val="multilevel"/>
     <w:tmpl w:val="4F4227DE"/>
@@ -11710,7 +12174,7 @@
       </w:pPr>
     </w:lvl>
   </w:abstractNum>
-  <w:abstractNum w:abstractNumId="14" w15:restartNumberingAfterBreak="0">
+  <w:abstractNum w:abstractNumId="15" w15:restartNumberingAfterBreak="0">
     <w:nsid w:val="4646393A"/>
     <w:multiLevelType w:val="multilevel"/>
     <w:tmpl w:val="BD224AE8"/>
@@ -11820,7 +12284,7 @@
       </w:rPr>
     </w:lvl>
   </w:abstractNum>
-  <w:abstractNum w:abstractNumId="15" w15:restartNumberingAfterBreak="0">
+  <w:abstractNum w:abstractNumId="16" w15:restartNumberingAfterBreak="0">
     <w:nsid w:val="4EA139ED"/>
     <w:multiLevelType w:val="multilevel"/>
     <w:tmpl w:val="929021E8"/>
@@ -11933,7 +12397,7 @@
       </w:rPr>
     </w:lvl>
   </w:abstractNum>
-  <w:abstractNum w:abstractNumId="16" w15:restartNumberingAfterBreak="0">
+  <w:abstractNum w:abstractNumId="17" w15:restartNumberingAfterBreak="0">
     <w:nsid w:val="539D7DA0"/>
     <w:multiLevelType w:val="hybridMultilevel"/>
     <w:tmpl w:val="781A1894"/>
@@ -12046,7 +12510,120 @@
       </w:rPr>
     </w:lvl>
   </w:abstractNum>
-  <w:abstractNum w:abstractNumId="17" w15:restartNumberingAfterBreak="0">
+  <w:abstractNum w:abstractNumId="18" w15:restartNumberingAfterBreak="0">
+    <w:nsid w:val="54DF2F2A"/>
+    <w:multiLevelType w:val="multilevel"/>
+    <w:tmpl w:val="DAC0911C"/>
+    <w:lvl w:ilvl="0">
+      <w:start w:val="1"/>
+      <w:numFmt w:val="decimal"/>
+      <w:lvlText w:val="%1."/>
+      <w:lvlJc w:val="left"/>
+      <w:pPr>
+        <w:ind w:left="360" w:hanging="360"/>
+      </w:pPr>
+      <w:rPr>
+        <w:rFonts w:hint="default"/>
+      </w:rPr>
+    </w:lvl>
+    <w:lvl w:ilvl="1">
+      <w:start w:val="1"/>
+      <w:numFmt w:val="decimal"/>
+      <w:lvlText w:val="5.%2."/>
+      <w:lvlJc w:val="left"/>
+      <w:pPr>
+        <w:ind w:left="792" w:hanging="432"/>
+      </w:pPr>
+      <w:rPr>
+        <w:rFonts w:hint="default"/>
+      </w:rPr>
+    </w:lvl>
+    <w:lvl w:ilvl="2">
+      <w:start w:val="1"/>
+      <w:numFmt w:val="decimal"/>
+      <w:lvlText w:val="%1.%2.%3."/>
+      <w:lvlJc w:val="left"/>
+      <w:pPr>
+        <w:ind w:left="1224" w:hanging="504"/>
+      </w:pPr>
+      <w:rPr>
+        <w:rFonts w:hint="default"/>
+      </w:rPr>
+    </w:lvl>
+    <w:lvl w:ilvl="3">
+      <w:start w:val="1"/>
+      <w:numFmt w:val="decimal"/>
+      <w:lvlText w:val="%1.%2.%3.%4."/>
+      <w:lvlJc w:val="left"/>
+      <w:pPr>
+        <w:ind w:left="1728" w:hanging="648"/>
+      </w:pPr>
+      <w:rPr>
+        <w:rFonts w:hint="default"/>
+      </w:rPr>
+    </w:lvl>
+    <w:lvl w:ilvl="4">
+      <w:start w:val="1"/>
+      <w:numFmt w:val="decimal"/>
+      <w:lvlText w:val="%1.%2.%3.%4.%5."/>
+      <w:lvlJc w:val="left"/>
+      <w:pPr>
+        <w:ind w:left="2232" w:hanging="792"/>
+      </w:pPr>
+      <w:rPr>
+        <w:rFonts w:hint="default"/>
+      </w:rPr>
+    </w:lvl>
+    <w:lvl w:ilvl="5">
+      <w:start w:val="1"/>
+      <w:numFmt w:val="decimal"/>
+      <w:lvlText w:val="%1.%2.%3.%4.%5.%6."/>
+      <w:lvlJc w:val="left"/>
+      <w:pPr>
+        <w:ind w:left="2736" w:hanging="936"/>
+      </w:pPr>
+      <w:rPr>
+        <w:rFonts w:hint="default"/>
+      </w:rPr>
+    </w:lvl>
+    <w:lvl w:ilvl="6">
+      <w:start w:val="1"/>
+      <w:numFmt w:val="decimal"/>
+      <w:lvlText w:val="%1.%2.%3.%4.%5.%6.%7."/>
+      <w:lvlJc w:val="left"/>
+      <w:pPr>
+        <w:ind w:left="3240" w:hanging="1080"/>
+      </w:pPr>
+      <w:rPr>
+        <w:rFonts w:hint="default"/>
+      </w:rPr>
+    </w:lvl>
+    <w:lvl w:ilvl="7">
+      <w:start w:val="1"/>
+      <w:numFmt w:val="decimal"/>
+      <w:lvlText w:val="%1.%2.%3.%4.%5.%6.%7.%8."/>
+      <w:lvlJc w:val="left"/>
+      <w:pPr>
+        <w:ind w:left="3744" w:hanging="1224"/>
+      </w:pPr>
+      <w:rPr>
+        <w:rFonts w:hint="default"/>
+      </w:rPr>
+    </w:lvl>
+    <w:lvl w:ilvl="8">
+      <w:start w:val="1"/>
+      <w:numFmt w:val="decimal"/>
+      <w:lvlText w:val="%1.%2.%3.%4.%5.%6.%7.%8.%9."/>
+      <w:lvlJc w:val="left"/>
+      <w:pPr>
+        <w:ind w:left="4320" w:hanging="1440"/>
+      </w:pPr>
+      <w:rPr>
+        <w:rFonts w:hint="default"/>
+      </w:rPr>
+    </w:lvl>
+  </w:abstractNum>
+  <w:abstractNum w:abstractNumId="19" w15:restartNumberingAfterBreak="0">
     <w:nsid w:val="58212346"/>
     <w:multiLevelType w:val="hybridMultilevel"/>
     <w:tmpl w:val="CC4ADD28"/>
@@ -12159,7 +12736,233 @@
       </w:rPr>
     </w:lvl>
   </w:abstractNum>
-  <w:abstractNum w:abstractNumId="18" w15:restartNumberingAfterBreak="0">
+  <w:abstractNum w:abstractNumId="20" w15:restartNumberingAfterBreak="0">
+    <w:nsid w:val="58F156B5"/>
+    <w:multiLevelType w:val="hybridMultilevel"/>
+    <w:tmpl w:val="43AA6196"/>
+    <w:lvl w:ilvl="0" w:tplc="38090001">
+      <w:start w:val="1"/>
+      <w:numFmt w:val="bullet"/>
+      <w:lvlText w:val=""/>
+      <w:lvlJc w:val="left"/>
+      <w:pPr>
+        <w:ind w:left="1146" w:hanging="360"/>
+      </w:pPr>
+      <w:rPr>
+        <w:rFonts w:ascii="Symbol" w:hAnsi="Symbol" w:hint="default"/>
+      </w:rPr>
+    </w:lvl>
+    <w:lvl w:ilvl="1" w:tplc="38090003" w:tentative="1">
+      <w:start w:val="1"/>
+      <w:numFmt w:val="bullet"/>
+      <w:lvlText w:val="o"/>
+      <w:lvlJc w:val="left"/>
+      <w:pPr>
+        <w:ind w:left="1866" w:hanging="360"/>
+      </w:pPr>
+      <w:rPr>
+        <w:rFonts w:ascii="Courier New" w:hAnsi="Courier New" w:cs="Courier New" w:hint="default"/>
+      </w:rPr>
+    </w:lvl>
+    <w:lvl w:ilvl="2" w:tplc="38090005" w:tentative="1">
+      <w:start w:val="1"/>
+      <w:numFmt w:val="bullet"/>
+      <w:lvlText w:val=""/>
+      <w:lvlJc w:val="left"/>
+      <w:pPr>
+        <w:ind w:left="2586" w:hanging="360"/>
+      </w:pPr>
+      <w:rPr>
+        <w:rFonts w:ascii="Wingdings" w:hAnsi="Wingdings" w:hint="default"/>
+      </w:rPr>
+    </w:lvl>
+    <w:lvl w:ilvl="3" w:tplc="38090001" w:tentative="1">
+      <w:start w:val="1"/>
+      <w:numFmt w:val="bullet"/>
+      <w:lvlText w:val=""/>
+      <w:lvlJc w:val="left"/>
+      <w:pPr>
+        <w:ind w:left="3306" w:hanging="360"/>
+      </w:pPr>
+      <w:rPr>
+        <w:rFonts w:ascii="Symbol" w:hAnsi="Symbol" w:hint="default"/>
+      </w:rPr>
+    </w:lvl>
+    <w:lvl w:ilvl="4" w:tplc="38090003" w:tentative="1">
+      <w:start w:val="1"/>
+      <w:numFmt w:val="bullet"/>
+      <w:lvlText w:val="o"/>
+      <w:lvlJc w:val="left"/>
+      <w:pPr>
+        <w:ind w:left="4026" w:hanging="360"/>
+      </w:pPr>
+      <w:rPr>
+        <w:rFonts w:ascii="Courier New" w:hAnsi="Courier New" w:cs="Courier New" w:hint="default"/>
+      </w:rPr>
+    </w:lvl>
+    <w:lvl w:ilvl="5" w:tplc="38090005" w:tentative="1">
+      <w:start w:val="1"/>
+      <w:numFmt w:val="bullet"/>
+      <w:lvlText w:val=""/>
+      <w:lvlJc w:val="left"/>
+      <w:pPr>
+        <w:ind w:left="4746" w:hanging="360"/>
+      </w:pPr>
+      <w:rPr>
+        <w:rFonts w:ascii="Wingdings" w:hAnsi="Wingdings" w:hint="default"/>
+      </w:rPr>
+    </w:lvl>
+    <w:lvl w:ilvl="6" w:tplc="38090001" w:tentative="1">
+      <w:start w:val="1"/>
+      <w:numFmt w:val="bullet"/>
+      <w:lvlText w:val=""/>
+      <w:lvlJc w:val="left"/>
+      <w:pPr>
+        <w:ind w:left="5466" w:hanging="360"/>
+      </w:pPr>
+      <w:rPr>
+        <w:rFonts w:ascii="Symbol" w:hAnsi="Symbol" w:hint="default"/>
+      </w:rPr>
+    </w:lvl>
+    <w:lvl w:ilvl="7" w:tplc="38090003" w:tentative="1">
+      <w:start w:val="1"/>
+      <w:numFmt w:val="bullet"/>
+      <w:lvlText w:val="o"/>
+      <w:lvlJc w:val="left"/>
+      <w:pPr>
+        <w:ind w:left="6186" w:hanging="360"/>
+      </w:pPr>
+      <w:rPr>
+        <w:rFonts w:ascii="Courier New" w:hAnsi="Courier New" w:cs="Courier New" w:hint="default"/>
+      </w:rPr>
+    </w:lvl>
+    <w:lvl w:ilvl="8" w:tplc="38090005" w:tentative="1">
+      <w:start w:val="1"/>
+      <w:numFmt w:val="bullet"/>
+      <w:lvlText w:val=""/>
+      <w:lvlJc w:val="left"/>
+      <w:pPr>
+        <w:ind w:left="6906" w:hanging="360"/>
+      </w:pPr>
+      <w:rPr>
+        <w:rFonts w:ascii="Wingdings" w:hAnsi="Wingdings" w:hint="default"/>
+      </w:rPr>
+    </w:lvl>
+  </w:abstractNum>
+  <w:abstractNum w:abstractNumId="21" w15:restartNumberingAfterBreak="0">
+    <w:nsid w:val="5D345EC9"/>
+    <w:multiLevelType w:val="multilevel"/>
+    <w:tmpl w:val="DAC0911C"/>
+    <w:lvl w:ilvl="0">
+      <w:start w:val="1"/>
+      <w:numFmt w:val="decimal"/>
+      <w:lvlText w:val="%1."/>
+      <w:lvlJc w:val="left"/>
+      <w:pPr>
+        <w:ind w:left="360" w:hanging="360"/>
+      </w:pPr>
+      <w:rPr>
+        <w:rFonts w:hint="default"/>
+      </w:rPr>
+    </w:lvl>
+    <w:lvl w:ilvl="1">
+      <w:start w:val="1"/>
+      <w:numFmt w:val="decimal"/>
+      <w:lvlText w:val="5.%2."/>
+      <w:lvlJc w:val="left"/>
+      <w:pPr>
+        <w:ind w:left="792" w:hanging="432"/>
+      </w:pPr>
+      <w:rPr>
+        <w:rFonts w:hint="default"/>
+      </w:rPr>
+    </w:lvl>
+    <w:lvl w:ilvl="2">
+      <w:start w:val="1"/>
+      <w:numFmt w:val="decimal"/>
+      <w:lvlText w:val="%1.%2.%3."/>
+      <w:lvlJc w:val="left"/>
+      <w:pPr>
+        <w:ind w:left="1224" w:hanging="504"/>
+      </w:pPr>
+      <w:rPr>
+        <w:rFonts w:hint="default"/>
+      </w:rPr>
+    </w:lvl>
+    <w:lvl w:ilvl="3">
+      <w:start w:val="1"/>
+      <w:numFmt w:val="decimal"/>
+      <w:lvlText w:val="%1.%2.%3.%4."/>
+      <w:lvlJc w:val="left"/>
+      <w:pPr>
+        <w:ind w:left="1728" w:hanging="648"/>
+      </w:pPr>
+      <w:rPr>
+        <w:rFonts w:hint="default"/>
+      </w:rPr>
+    </w:lvl>
+    <w:lvl w:ilvl="4">
+      <w:start w:val="1"/>
+      <w:numFmt w:val="decimal"/>
+      <w:lvlText w:val="%1.%2.%3.%4.%5."/>
+      <w:lvlJc w:val="left"/>
+      <w:pPr>
+        <w:ind w:left="2232" w:hanging="792"/>
+      </w:pPr>
+      <w:rPr>
+        <w:rFonts w:hint="default"/>
+      </w:rPr>
+    </w:lvl>
+    <w:lvl w:ilvl="5">
+      <w:start w:val="1"/>
+      <w:numFmt w:val="decimal"/>
+      <w:lvlText w:val="%1.%2.%3.%4.%5.%6."/>
+      <w:lvlJc w:val="left"/>
+      <w:pPr>
+        <w:ind w:left="2736" w:hanging="936"/>
+      </w:pPr>
+      <w:rPr>
+        <w:rFonts w:hint="default"/>
+      </w:rPr>
+    </w:lvl>
+    <w:lvl w:ilvl="6">
+      <w:start w:val="1"/>
+      <w:numFmt w:val="decimal"/>
+      <w:lvlText w:val="%1.%2.%3.%4.%5.%6.%7."/>
+      <w:lvlJc w:val="left"/>
+      <w:pPr>
+        <w:ind w:left="3240" w:hanging="1080"/>
+      </w:pPr>
+      <w:rPr>
+        <w:rFonts w:hint="default"/>
+      </w:rPr>
+    </w:lvl>
+    <w:lvl w:ilvl="7">
+      <w:start w:val="1"/>
+      <w:numFmt w:val="decimal"/>
+      <w:lvlText w:val="%1.%2.%3.%4.%5.%6.%7.%8."/>
+      <w:lvlJc w:val="left"/>
+      <w:pPr>
+        <w:ind w:left="3744" w:hanging="1224"/>
+      </w:pPr>
+      <w:rPr>
+        <w:rFonts w:hint="default"/>
+      </w:rPr>
+    </w:lvl>
+    <w:lvl w:ilvl="8">
+      <w:start w:val="1"/>
+      <w:numFmt w:val="decimal"/>
+      <w:lvlText w:val="%1.%2.%3.%4.%5.%6.%7.%8.%9."/>
+      <w:lvlJc w:val="left"/>
+      <w:pPr>
+        <w:ind w:left="4320" w:hanging="1440"/>
+      </w:pPr>
+      <w:rPr>
+        <w:rFonts w:hint="default"/>
+      </w:rPr>
+    </w:lvl>
+  </w:abstractNum>
+  <w:abstractNum w:abstractNumId="22" w15:restartNumberingAfterBreak="0">
     <w:nsid w:val="64EE4379"/>
     <w:multiLevelType w:val="multilevel"/>
     <w:tmpl w:val="33887266"/>
@@ -12248,7 +13051,7 @@
       </w:pPr>
     </w:lvl>
   </w:abstractNum>
-  <w:abstractNum w:abstractNumId="19" w15:restartNumberingAfterBreak="0">
+  <w:abstractNum w:abstractNumId="23" w15:restartNumberingAfterBreak="0">
     <w:nsid w:val="7042763D"/>
     <w:multiLevelType w:val="hybridMultilevel"/>
     <w:tmpl w:val="A8FA09CA"/>
@@ -12361,7 +13164,7 @@
       </w:rPr>
     </w:lvl>
   </w:abstractNum>
-  <w:abstractNum w:abstractNumId="20" w15:restartNumberingAfterBreak="0">
+  <w:abstractNum w:abstractNumId="24" w15:restartNumberingAfterBreak="0">
     <w:nsid w:val="79E649FA"/>
     <w:multiLevelType w:val="hybridMultilevel"/>
     <w:tmpl w:val="5D54BE58"/>
@@ -12475,67 +13278,79 @@
     </w:lvl>
   </w:abstractNum>
   <w:num w:numId="1" w16cid:durableId="1406143775">
+    <w:abstractNumId w:val="4"/>
+  </w:num>
+  <w:num w:numId="2" w16cid:durableId="1748069314">
+    <w:abstractNumId w:val="10"/>
+  </w:num>
+  <w:num w:numId="3" w16cid:durableId="1296787817">
+    <w:abstractNumId w:val="11"/>
+  </w:num>
+  <w:num w:numId="4" w16cid:durableId="1198738994">
+    <w:abstractNumId w:val="22"/>
+  </w:num>
+  <w:num w:numId="5" w16cid:durableId="845945470">
+    <w:abstractNumId w:val="2"/>
+  </w:num>
+  <w:num w:numId="6" w16cid:durableId="665524019">
+    <w:abstractNumId w:val="14"/>
+  </w:num>
+  <w:num w:numId="7" w16cid:durableId="668020486">
+    <w:abstractNumId w:val="13"/>
+  </w:num>
+  <w:num w:numId="8" w16cid:durableId="1199975083">
+    <w:abstractNumId w:val="5"/>
+  </w:num>
+  <w:num w:numId="9" w16cid:durableId="75135086">
+    <w:abstractNumId w:val="6"/>
+  </w:num>
+  <w:num w:numId="10" w16cid:durableId="497960826">
+    <w:abstractNumId w:val="15"/>
+  </w:num>
+  <w:num w:numId="11" w16cid:durableId="326983446">
     <w:abstractNumId w:val="3"/>
   </w:num>
-  <w:num w:numId="2" w16cid:durableId="1748069314">
+  <w:num w:numId="12" w16cid:durableId="1706904810">
+    <w:abstractNumId w:val="23"/>
+  </w:num>
+  <w:num w:numId="13" w16cid:durableId="452290699">
+    <w:abstractNumId w:val="24"/>
+  </w:num>
+  <w:num w:numId="14" w16cid:durableId="1452167094">
+    <w:abstractNumId w:val="1"/>
+  </w:num>
+  <w:num w:numId="15" w16cid:durableId="1269511272">
+    <w:abstractNumId w:val="7"/>
+  </w:num>
+  <w:num w:numId="16" w16cid:durableId="1899515761">
+    <w:abstractNumId w:val="19"/>
+  </w:num>
+  <w:num w:numId="17" w16cid:durableId="405762801">
+    <w:abstractNumId w:val="16"/>
+  </w:num>
+  <w:num w:numId="18" w16cid:durableId="1047142656">
+    <w:abstractNumId w:val="8"/>
+  </w:num>
+  <w:num w:numId="19" w16cid:durableId="156654783">
+    <w:abstractNumId w:val="17"/>
+  </w:num>
+  <w:num w:numId="20" w16cid:durableId="160509088">
+    <w:abstractNumId w:val="12"/>
+  </w:num>
+  <w:num w:numId="21" w16cid:durableId="687409916">
     <w:abstractNumId w:val="9"/>
   </w:num>
-  <w:num w:numId="3" w16cid:durableId="1296787817">
-    <w:abstractNumId w:val="10"/>
-  </w:num>
-  <w:num w:numId="4" w16cid:durableId="1198738994">
+  <w:num w:numId="22" w16cid:durableId="205027057">
     <w:abstractNumId w:val="18"/>
   </w:num>
-  <w:num w:numId="5" w16cid:durableId="845945470">
-    <w:abstractNumId w:val="1"/>
-  </w:num>
-  <w:num w:numId="6" w16cid:durableId="665524019">
-    <w:abstractNumId w:val="13"/>
-  </w:num>
-  <w:num w:numId="7" w16cid:durableId="668020486">
-    <w:abstractNumId w:val="12"/>
-  </w:num>
-  <w:num w:numId="8" w16cid:durableId="1199975083">
-    <w:abstractNumId w:val="4"/>
-  </w:num>
-  <w:num w:numId="9" w16cid:durableId="75135086">
-    <w:abstractNumId w:val="5"/>
-  </w:num>
-  <w:num w:numId="10" w16cid:durableId="497960826">
-    <w:abstractNumId w:val="14"/>
-  </w:num>
-  <w:num w:numId="11" w16cid:durableId="326983446">
-    <w:abstractNumId w:val="2"/>
-  </w:num>
-  <w:num w:numId="12" w16cid:durableId="1706904810">
-    <w:abstractNumId w:val="19"/>
-  </w:num>
-  <w:num w:numId="13" w16cid:durableId="452290699">
+  <w:num w:numId="23" w16cid:durableId="1570142908">
     <w:abstractNumId w:val="20"/>
   </w:num>
-  <w:num w:numId="14" w16cid:durableId="1452167094">
+  <w:num w:numId="24" w16cid:durableId="204567969">
     <w:abstractNumId w:val="0"/>
   </w:num>
-  <w:num w:numId="15" w16cid:durableId="1269511272">
-    <w:abstractNumId w:val="6"/>
-  </w:num>
-  <w:num w:numId="16" w16cid:durableId="1899515761">
-    <w:abstractNumId w:val="17"/>
-  </w:num>
-  <w:num w:numId="17" w16cid:durableId="405762801">
-    <w:abstractNumId w:val="15"/>
-  </w:num>
-  <w:num w:numId="18" w16cid:durableId="1047142656">
-    <w:abstractNumId w:val="7"/>
-  </w:num>
-  <w:num w:numId="19" w16cid:durableId="156654783">
-    <w:abstractNumId w:val="16"/>
-  </w:num>
-  <w:num w:numId="20" w16cid:durableId="160509088">
-    <w:abstractNumId w:val="11"/>
-  </w:num>
-  <w:num w:numId="21" w16cid:durableId="687409916">
-    <w:abstractNumId w:val="8"/>
+  <w:num w:numId="25" w16cid:durableId="441340468">
+    <w:abstractNumId w:val="21"/>
   </w:num>
 </w:numbering>
 </file>

</xml_diff>

<commit_message>
Add initial project setup with React components and SVG assets
- Created new SVG files for React and Vite logos.
- Added basic structure for Content, Footer, Header, and Hero components.
- Implemented global CSS styles for the application.
- Set up main entry point with React and Vite configuration.
</commit_message>
<xml_diff>
--- a/dokumen/Modul Pelatihan React v4.0.docx
+++ b/dokumen/Modul Pelatihan React v4.0.docx
@@ -85,7 +85,7 @@
       <w:pPr>
         <w:pStyle w:val="Heading1"/>
       </w:pPr>
-      <w:bookmarkStart w:id="0" w:name="_Toc235049341"/>
+      <w:bookmarkStart w:id="0" w:name="_Toc235136650"/>
       <w:r>
         <w:lastRenderedPageBreak/>
         <w:t>KATA PENGANTAR</w:t>
@@ -235,7 +235,7 @@
       <w:pPr>
         <w:pStyle w:val="Heading1"/>
       </w:pPr>
-      <w:bookmarkStart w:id="1" w:name="_Toc235049342"/>
+      <w:bookmarkStart w:id="1" w:name="_Toc235136651"/>
       <w:r>
         <w:lastRenderedPageBreak/>
         <w:t>DAFTAR ISI</w:t>
@@ -291,7 +291,7 @@
           <w:r>
             <w:fldChar w:fldCharType="separate"/>
           </w:r>
-          <w:hyperlink w:anchor="_Toc235049341" w:history="1">
+          <w:hyperlink w:anchor="_Toc235136650" w:history="1">
             <w:r>
               <w:rPr>
                 <w:rStyle w:val="Hyperlink"/>
@@ -314,7 +314,7 @@
               <w:rPr>
                 <w:webHidden/>
               </w:rPr>
-              <w:instrText xml:space="preserve"> PAGEREF _Toc235049341 \h </w:instrText>
+              <w:instrText xml:space="preserve"> PAGEREF _Toc235136650 \h </w:instrText>
             </w:r>
             <w:r>
               <w:rPr>
@@ -351,7 +351,7 @@
               <w:lang w:eastAsia="en-ID"/>
             </w:rPr>
           </w:pPr>
-          <w:hyperlink w:anchor="_Toc235049342" w:history="1">
+          <w:hyperlink w:anchor="_Toc235136651" w:history="1">
             <w:r>
               <w:rPr>
                 <w:rStyle w:val="Hyperlink"/>
@@ -374,7 +374,7 @@
               <w:rPr>
                 <w:webHidden/>
               </w:rPr>
-              <w:instrText xml:space="preserve"> PAGEREF _Toc235049342 \h </w:instrText>
+              <w:instrText xml:space="preserve"> PAGEREF _Toc235136651 \h </w:instrText>
             </w:r>
             <w:r>
               <w:rPr>
@@ -411,7 +411,7 @@
               <w:lang w:eastAsia="en-ID"/>
             </w:rPr>
           </w:pPr>
-          <w:hyperlink w:anchor="_Toc235049343" w:history="1">
+          <w:hyperlink w:anchor="_Toc235136652" w:history="1">
             <w:r>
               <w:rPr>
                 <w:rStyle w:val="Hyperlink"/>
@@ -434,7 +434,7 @@
               <w:rPr>
                 <w:webHidden/>
               </w:rPr>
-              <w:instrText xml:space="preserve"> PAGEREF _Toc235049343 \h </w:instrText>
+              <w:instrText xml:space="preserve"> PAGEREF _Toc235136652 \h </w:instrText>
             </w:r>
             <w:r>
               <w:rPr>
@@ -474,7 +474,7 @@
               <w:lang w:eastAsia="en-ID"/>
             </w:rPr>
           </w:pPr>
-          <w:hyperlink w:anchor="_Toc235049344" w:history="1">
+          <w:hyperlink w:anchor="_Toc235136653" w:history="1">
             <w:r>
               <w:rPr>
                 <w:rStyle w:val="Hyperlink"/>
@@ -516,7 +516,7 @@
                 <w:noProof/>
                 <w:webHidden/>
               </w:rPr>
-              <w:instrText xml:space="preserve"> PAGEREF _Toc235049344 \h </w:instrText>
+              <w:instrText xml:space="preserve"> PAGEREF _Toc235136653 \h </w:instrText>
             </w:r>
             <w:r>
               <w:rPr>
@@ -560,7 +560,7 @@
               <w:lang w:eastAsia="en-ID"/>
             </w:rPr>
           </w:pPr>
-          <w:hyperlink w:anchor="_Toc235049345" w:history="1">
+          <w:hyperlink w:anchor="_Toc235136654" w:history="1">
             <w:r>
               <w:rPr>
                 <w:rStyle w:val="Hyperlink"/>
@@ -602,7 +602,7 @@
                 <w:noProof/>
                 <w:webHidden/>
               </w:rPr>
-              <w:instrText xml:space="preserve"> PAGEREF _Toc235049345 \h </w:instrText>
+              <w:instrText xml:space="preserve"> PAGEREF _Toc235136654 \h </w:instrText>
             </w:r>
             <w:r>
               <w:rPr>
@@ -646,7 +646,7 @@
               <w:lang w:eastAsia="en-ID"/>
             </w:rPr>
           </w:pPr>
-          <w:hyperlink w:anchor="_Toc235049346" w:history="1">
+          <w:hyperlink w:anchor="_Toc235136655" w:history="1">
             <w:r>
               <w:rPr>
                 <w:rStyle w:val="Hyperlink"/>
@@ -688,7 +688,7 @@
                 <w:noProof/>
                 <w:webHidden/>
               </w:rPr>
-              <w:instrText xml:space="preserve"> PAGEREF _Toc235049346 \h </w:instrText>
+              <w:instrText xml:space="preserve"> PAGEREF _Toc235136655 \h </w:instrText>
             </w:r>
             <w:r>
               <w:rPr>
@@ -732,7 +732,7 @@
               <w:lang w:eastAsia="en-ID"/>
             </w:rPr>
           </w:pPr>
-          <w:hyperlink w:anchor="_Toc235049347" w:history="1">
+          <w:hyperlink w:anchor="_Toc235136656" w:history="1">
             <w:r>
               <w:rPr>
                 <w:rStyle w:val="Hyperlink"/>
@@ -774,7 +774,7 @@
                 <w:noProof/>
                 <w:webHidden/>
               </w:rPr>
-              <w:instrText xml:space="preserve"> PAGEREF _Toc235049347 \h </w:instrText>
+              <w:instrText xml:space="preserve"> PAGEREF _Toc235136656 \h </w:instrText>
             </w:r>
             <w:r>
               <w:rPr>
@@ -818,7 +818,7 @@
               <w:lang w:eastAsia="en-ID"/>
             </w:rPr>
           </w:pPr>
-          <w:hyperlink w:anchor="_Toc235049348" w:history="1">
+          <w:hyperlink w:anchor="_Toc235136657" w:history="1">
             <w:r>
               <w:rPr>
                 <w:rStyle w:val="Hyperlink"/>
@@ -860,7 +860,7 @@
                 <w:noProof/>
                 <w:webHidden/>
               </w:rPr>
-              <w:instrText xml:space="preserve"> PAGEREF _Toc235049348 \h </w:instrText>
+              <w:instrText xml:space="preserve"> PAGEREF _Toc235136657 \h </w:instrText>
             </w:r>
             <w:r>
               <w:rPr>
@@ -904,7 +904,7 @@
               <w:lang w:eastAsia="en-ID"/>
             </w:rPr>
           </w:pPr>
-          <w:hyperlink w:anchor="_Toc235049349" w:history="1">
+          <w:hyperlink w:anchor="_Toc235136658" w:history="1">
             <w:r>
               <w:rPr>
                 <w:rStyle w:val="Hyperlink"/>
@@ -946,7 +946,7 @@
                 <w:noProof/>
                 <w:webHidden/>
               </w:rPr>
-              <w:instrText xml:space="preserve"> PAGEREF _Toc235049349 \h </w:instrText>
+              <w:instrText xml:space="preserve"> PAGEREF _Toc235136658 \h </w:instrText>
             </w:r>
             <w:r>
               <w:rPr>
@@ -990,7 +990,7 @@
               <w:lang w:eastAsia="en-ID"/>
             </w:rPr>
           </w:pPr>
-          <w:hyperlink w:anchor="_Toc235049350" w:history="1">
+          <w:hyperlink w:anchor="_Toc235136659" w:history="1">
             <w:r>
               <w:rPr>
                 <w:rStyle w:val="Hyperlink"/>
@@ -1032,7 +1032,7 @@
                 <w:noProof/>
                 <w:webHidden/>
               </w:rPr>
-              <w:instrText xml:space="preserve"> PAGEREF _Toc235049350 \h </w:instrText>
+              <w:instrText xml:space="preserve"> PAGEREF _Toc235136659 \h </w:instrText>
             </w:r>
             <w:r>
               <w:rPr>
@@ -1073,7 +1073,7 @@
               <w:lang w:eastAsia="en-ID"/>
             </w:rPr>
           </w:pPr>
-          <w:hyperlink w:anchor="_Toc235049351" w:history="1">
+          <w:hyperlink w:anchor="_Toc235136660" w:history="1">
             <w:r>
               <w:rPr>
                 <w:rStyle w:val="Hyperlink"/>
@@ -1096,7 +1096,7 @@
               <w:rPr>
                 <w:webHidden/>
               </w:rPr>
-              <w:instrText xml:space="preserve"> PAGEREF _Toc235049351 \h </w:instrText>
+              <w:instrText xml:space="preserve"> PAGEREF _Toc235136660 \h </w:instrText>
             </w:r>
             <w:r>
               <w:rPr>
@@ -1136,7 +1136,7 @@
               <w:lang w:eastAsia="en-ID"/>
             </w:rPr>
           </w:pPr>
-          <w:hyperlink w:anchor="_Toc235049352" w:history="1">
+          <w:hyperlink w:anchor="_Toc235136661" w:history="1">
             <w:r>
               <w:rPr>
                 <w:rStyle w:val="Hyperlink"/>
@@ -1178,7 +1178,7 @@
                 <w:noProof/>
                 <w:webHidden/>
               </w:rPr>
-              <w:instrText xml:space="preserve"> PAGEREF _Toc235049352 \h </w:instrText>
+              <w:instrText xml:space="preserve"> PAGEREF _Toc235136661 \h </w:instrText>
             </w:r>
             <w:r>
               <w:rPr>
@@ -1222,7 +1222,7 @@
               <w:lang w:eastAsia="en-ID"/>
             </w:rPr>
           </w:pPr>
-          <w:hyperlink w:anchor="_Toc235049353" w:history="1">
+          <w:hyperlink w:anchor="_Toc235136662" w:history="1">
             <w:r>
               <w:rPr>
                 <w:rStyle w:val="Hyperlink"/>
@@ -1264,7 +1264,7 @@
                 <w:noProof/>
                 <w:webHidden/>
               </w:rPr>
-              <w:instrText xml:space="preserve"> PAGEREF _Toc235049353 \h </w:instrText>
+              <w:instrText xml:space="preserve"> PAGEREF _Toc235136662 \h </w:instrText>
             </w:r>
             <w:r>
               <w:rPr>
@@ -1308,7 +1308,7 @@
               <w:lang w:eastAsia="en-ID"/>
             </w:rPr>
           </w:pPr>
-          <w:hyperlink w:anchor="_Toc235049354" w:history="1">
+          <w:hyperlink w:anchor="_Toc235136663" w:history="1">
             <w:r>
               <w:rPr>
                 <w:rStyle w:val="Hyperlink"/>
@@ -1350,7 +1350,7 @@
                 <w:noProof/>
                 <w:webHidden/>
               </w:rPr>
-              <w:instrText xml:space="preserve"> PAGEREF _Toc235049354 \h </w:instrText>
+              <w:instrText xml:space="preserve"> PAGEREF _Toc235136663 \h </w:instrText>
             </w:r>
             <w:r>
               <w:rPr>
@@ -1394,7 +1394,7 @@
               <w:lang w:eastAsia="en-ID"/>
             </w:rPr>
           </w:pPr>
-          <w:hyperlink w:anchor="_Toc235049355" w:history="1">
+          <w:hyperlink w:anchor="_Toc235136664" w:history="1">
             <w:r>
               <w:rPr>
                 <w:rStyle w:val="Hyperlink"/>
@@ -1436,7 +1436,7 @@
                 <w:noProof/>
                 <w:webHidden/>
               </w:rPr>
-              <w:instrText xml:space="preserve"> PAGEREF _Toc235049355 \h </w:instrText>
+              <w:instrText xml:space="preserve"> PAGEREF _Toc235136664 \h </w:instrText>
             </w:r>
             <w:r>
               <w:rPr>
@@ -1480,7 +1480,7 @@
               <w:lang w:eastAsia="en-ID"/>
             </w:rPr>
           </w:pPr>
-          <w:hyperlink w:anchor="_Toc235049356" w:history="1">
+          <w:hyperlink w:anchor="_Toc235136665" w:history="1">
             <w:r>
               <w:rPr>
                 <w:rStyle w:val="Hyperlink"/>
@@ -1522,7 +1522,7 @@
                 <w:noProof/>
                 <w:webHidden/>
               </w:rPr>
-              <w:instrText xml:space="preserve"> PAGEREF _Toc235049356 \h </w:instrText>
+              <w:instrText xml:space="preserve"> PAGEREF _Toc235136665 \h </w:instrText>
             </w:r>
             <w:r>
               <w:rPr>
@@ -1566,7 +1566,7 @@
               <w:lang w:eastAsia="en-ID"/>
             </w:rPr>
           </w:pPr>
-          <w:hyperlink w:anchor="_Toc235049357" w:history="1">
+          <w:hyperlink w:anchor="_Toc235136666" w:history="1">
             <w:r>
               <w:rPr>
                 <w:rStyle w:val="Hyperlink"/>
@@ -1608,7 +1608,7 @@
                 <w:noProof/>
                 <w:webHidden/>
               </w:rPr>
-              <w:instrText xml:space="preserve"> PAGEREF _Toc235049357 \h </w:instrText>
+              <w:instrText xml:space="preserve"> PAGEREF _Toc235136666 \h </w:instrText>
             </w:r>
             <w:r>
               <w:rPr>
@@ -1649,7 +1649,7 @@
               <w:lang w:eastAsia="en-ID"/>
             </w:rPr>
           </w:pPr>
-          <w:hyperlink w:anchor="_Toc235049358" w:history="1">
+          <w:hyperlink w:anchor="_Toc235136667" w:history="1">
             <w:r>
               <w:rPr>
                 <w:rStyle w:val="Hyperlink"/>
@@ -1672,7 +1672,7 @@
               <w:rPr>
                 <w:webHidden/>
               </w:rPr>
-              <w:instrText xml:space="preserve"> PAGEREF _Toc235049358 \h </w:instrText>
+              <w:instrText xml:space="preserve"> PAGEREF _Toc235136667 \h </w:instrText>
             </w:r>
             <w:r>
               <w:rPr>
@@ -1712,7 +1712,7 @@
               <w:lang w:eastAsia="en-ID"/>
             </w:rPr>
           </w:pPr>
-          <w:hyperlink w:anchor="_Toc235049359" w:history="1">
+          <w:hyperlink w:anchor="_Toc235136668" w:history="1">
             <w:r>
               <w:rPr>
                 <w:rStyle w:val="Hyperlink"/>
@@ -1754,7 +1754,7 @@
                 <w:noProof/>
                 <w:webHidden/>
               </w:rPr>
-              <w:instrText xml:space="preserve"> PAGEREF _Toc235049359 \h </w:instrText>
+              <w:instrText xml:space="preserve"> PAGEREF _Toc235136668 \h </w:instrText>
             </w:r>
             <w:r>
               <w:rPr>
@@ -1798,7 +1798,7 @@
               <w:lang w:eastAsia="en-ID"/>
             </w:rPr>
           </w:pPr>
-          <w:hyperlink w:anchor="_Toc235049360" w:history="1">
+          <w:hyperlink w:anchor="_Toc235136669" w:history="1">
             <w:r>
               <w:rPr>
                 <w:rStyle w:val="Hyperlink"/>
@@ -1840,7 +1840,7 @@
                 <w:noProof/>
                 <w:webHidden/>
               </w:rPr>
-              <w:instrText xml:space="preserve"> PAGEREF _Toc235049360 \h </w:instrText>
+              <w:instrText xml:space="preserve"> PAGEREF _Toc235136669 \h </w:instrText>
             </w:r>
             <w:r>
               <w:rPr>
@@ -1884,7 +1884,7 @@
               <w:lang w:eastAsia="en-ID"/>
             </w:rPr>
           </w:pPr>
-          <w:hyperlink w:anchor="_Toc235049361" w:history="1">
+          <w:hyperlink w:anchor="_Toc235136670" w:history="1">
             <w:r>
               <w:rPr>
                 <w:rStyle w:val="Hyperlink"/>
@@ -1926,7 +1926,7 @@
                 <w:noProof/>
                 <w:webHidden/>
               </w:rPr>
-              <w:instrText xml:space="preserve"> PAGEREF _Toc235049361 \h </w:instrText>
+              <w:instrText xml:space="preserve"> PAGEREF _Toc235136670 \h </w:instrText>
             </w:r>
             <w:r>
               <w:rPr>
@@ -1970,7 +1970,7 @@
               <w:lang w:eastAsia="en-ID"/>
             </w:rPr>
           </w:pPr>
-          <w:hyperlink w:anchor="_Toc235049362" w:history="1">
+          <w:hyperlink w:anchor="_Toc235136671" w:history="1">
             <w:r>
               <w:rPr>
                 <w:rStyle w:val="Hyperlink"/>
@@ -2012,7 +2012,7 @@
                 <w:noProof/>
                 <w:webHidden/>
               </w:rPr>
-              <w:instrText xml:space="preserve"> PAGEREF _Toc235049362 \h </w:instrText>
+              <w:instrText xml:space="preserve"> PAGEREF _Toc235136671 \h </w:instrText>
             </w:r>
             <w:r>
               <w:rPr>
@@ -2056,7 +2056,7 @@
               <w:lang w:eastAsia="en-ID"/>
             </w:rPr>
           </w:pPr>
-          <w:hyperlink w:anchor="_Toc235049363" w:history="1">
+          <w:hyperlink w:anchor="_Toc235136672" w:history="1">
             <w:r>
               <w:rPr>
                 <w:rStyle w:val="Hyperlink"/>
@@ -2098,7 +2098,7 @@
                 <w:noProof/>
                 <w:webHidden/>
               </w:rPr>
-              <w:instrText xml:space="preserve"> PAGEREF _Toc235049363 \h </w:instrText>
+              <w:instrText xml:space="preserve"> PAGEREF _Toc235136672 \h </w:instrText>
             </w:r>
             <w:r>
               <w:rPr>
@@ -2142,7 +2142,7 @@
               <w:lang w:eastAsia="en-ID"/>
             </w:rPr>
           </w:pPr>
-          <w:hyperlink w:anchor="_Toc235049364" w:history="1">
+          <w:hyperlink w:anchor="_Toc235136673" w:history="1">
             <w:r>
               <w:rPr>
                 <w:rStyle w:val="Hyperlink"/>
@@ -2184,7 +2184,7 @@
                 <w:noProof/>
                 <w:webHidden/>
               </w:rPr>
-              <w:instrText xml:space="preserve"> PAGEREF _Toc235049364 \h </w:instrText>
+              <w:instrText xml:space="preserve"> PAGEREF _Toc235136673 \h </w:instrText>
             </w:r>
             <w:r>
               <w:rPr>
@@ -2228,7 +2228,7 @@
               <w:lang w:eastAsia="en-ID"/>
             </w:rPr>
           </w:pPr>
-          <w:hyperlink w:anchor="_Toc235049365" w:history="1">
+          <w:hyperlink w:anchor="_Toc235136674" w:history="1">
             <w:r>
               <w:rPr>
                 <w:rStyle w:val="Hyperlink"/>
@@ -2270,7 +2270,7 @@
                 <w:noProof/>
                 <w:webHidden/>
               </w:rPr>
-              <w:instrText xml:space="preserve"> PAGEREF _Toc235049365 \h </w:instrText>
+              <w:instrText xml:space="preserve"> PAGEREF _Toc235136674 \h </w:instrText>
             </w:r>
             <w:r>
               <w:rPr>
@@ -2311,7 +2311,7 @@
               <w:lang w:eastAsia="en-ID"/>
             </w:rPr>
           </w:pPr>
-          <w:hyperlink w:anchor="_Toc235049366" w:history="1">
+          <w:hyperlink w:anchor="_Toc235136675" w:history="1">
             <w:r>
               <w:rPr>
                 <w:rStyle w:val="Hyperlink"/>
@@ -2334,7 +2334,7 @@
               <w:rPr>
                 <w:webHidden/>
               </w:rPr>
-              <w:instrText xml:space="preserve"> PAGEREF _Toc235049366 \h </w:instrText>
+              <w:instrText xml:space="preserve"> PAGEREF _Toc235136675 \h </w:instrText>
             </w:r>
             <w:r>
               <w:rPr>
@@ -2374,7 +2374,7 @@
               <w:lang w:eastAsia="en-ID"/>
             </w:rPr>
           </w:pPr>
-          <w:hyperlink w:anchor="_Toc235049367" w:history="1">
+          <w:hyperlink w:anchor="_Toc235136676" w:history="1">
             <w:r>
               <w:rPr>
                 <w:rStyle w:val="Hyperlink"/>
@@ -2416,7 +2416,7 @@
                 <w:noProof/>
                 <w:webHidden/>
               </w:rPr>
-              <w:instrText xml:space="preserve"> PAGEREF _Toc235049367 \h </w:instrText>
+              <w:instrText xml:space="preserve"> PAGEREF _Toc235136676 \h </w:instrText>
             </w:r>
             <w:r>
               <w:rPr>
@@ -2460,7 +2460,7 @@
               <w:lang w:eastAsia="en-ID"/>
             </w:rPr>
           </w:pPr>
-          <w:hyperlink w:anchor="_Toc235049368" w:history="1">
+          <w:hyperlink w:anchor="_Toc235136677" w:history="1">
             <w:r>
               <w:rPr>
                 <w:rStyle w:val="Hyperlink"/>
@@ -2502,7 +2502,7 @@
                 <w:noProof/>
                 <w:webHidden/>
               </w:rPr>
-              <w:instrText xml:space="preserve"> PAGEREF _Toc235049368 \h </w:instrText>
+              <w:instrText xml:space="preserve"> PAGEREF _Toc235136677 \h </w:instrText>
             </w:r>
             <w:r>
               <w:rPr>
@@ -2546,7 +2546,7 @@
               <w:lang w:eastAsia="en-ID"/>
             </w:rPr>
           </w:pPr>
-          <w:hyperlink w:anchor="_Toc235049369" w:history="1">
+          <w:hyperlink w:anchor="_Toc235136678" w:history="1">
             <w:r>
               <w:rPr>
                 <w:rStyle w:val="Hyperlink"/>
@@ -2588,7 +2588,7 @@
                 <w:noProof/>
                 <w:webHidden/>
               </w:rPr>
-              <w:instrText xml:space="preserve"> PAGEREF _Toc235049369 \h </w:instrText>
+              <w:instrText xml:space="preserve"> PAGEREF _Toc235136678 \h </w:instrText>
             </w:r>
             <w:r>
               <w:rPr>
@@ -2608,7 +2608,7 @@
                 <w:noProof/>
                 <w:webHidden/>
               </w:rPr>
-              <w:t>29</w:t>
+              <w:t>30</w:t>
             </w:r>
             <w:r>
               <w:rPr>
@@ -2632,7 +2632,7 @@
               <w:lang w:eastAsia="en-ID"/>
             </w:rPr>
           </w:pPr>
-          <w:hyperlink w:anchor="_Toc235049370" w:history="1">
+          <w:hyperlink w:anchor="_Toc235136679" w:history="1">
             <w:r>
               <w:rPr>
                 <w:rStyle w:val="Hyperlink"/>
@@ -2674,7 +2674,7 @@
                 <w:noProof/>
                 <w:webHidden/>
               </w:rPr>
-              <w:instrText xml:space="preserve"> PAGEREF _Toc235049370 \h </w:instrText>
+              <w:instrText xml:space="preserve"> PAGEREF _Toc235136679 \h </w:instrText>
             </w:r>
             <w:r>
               <w:rPr>
@@ -2694,7 +2694,7 @@
                 <w:noProof/>
                 <w:webHidden/>
               </w:rPr>
-              <w:t>31</w:t>
+              <w:t>32</w:t>
             </w:r>
             <w:r>
               <w:rPr>
@@ -2718,7 +2718,7 @@
               <w:lang w:eastAsia="en-ID"/>
             </w:rPr>
           </w:pPr>
-          <w:hyperlink w:anchor="_Toc235049371" w:history="1">
+          <w:hyperlink w:anchor="_Toc235136680" w:history="1">
             <w:r>
               <w:rPr>
                 <w:rStyle w:val="Hyperlink"/>
@@ -2760,7 +2760,7 @@
                 <w:noProof/>
                 <w:webHidden/>
               </w:rPr>
-              <w:instrText xml:space="preserve"> PAGEREF _Toc235049371 \h </w:instrText>
+              <w:instrText xml:space="preserve"> PAGEREF _Toc235136680 \h </w:instrText>
             </w:r>
             <w:r>
               <w:rPr>
@@ -2780,7 +2780,7 @@
                 <w:noProof/>
                 <w:webHidden/>
               </w:rPr>
-              <w:t>32</w:t>
+              <w:t>33</w:t>
             </w:r>
             <w:r>
               <w:rPr>
@@ -2804,7 +2804,7 @@
               <w:lang w:eastAsia="en-ID"/>
             </w:rPr>
           </w:pPr>
-          <w:hyperlink w:anchor="_Toc235049372" w:history="1">
+          <w:hyperlink w:anchor="_Toc235136681" w:history="1">
             <w:r>
               <w:rPr>
                 <w:rStyle w:val="Hyperlink"/>
@@ -2846,7 +2846,7 @@
                 <w:noProof/>
                 <w:webHidden/>
               </w:rPr>
-              <w:instrText xml:space="preserve"> PAGEREF _Toc235049372 \h </w:instrText>
+              <w:instrText xml:space="preserve"> PAGEREF _Toc235136681 \h </w:instrText>
             </w:r>
             <w:r>
               <w:rPr>
@@ -2866,7 +2866,7 @@
                 <w:noProof/>
                 <w:webHidden/>
               </w:rPr>
-              <w:t>33</w:t>
+              <w:t>34</w:t>
             </w:r>
             <w:r>
               <w:rPr>
@@ -2890,7 +2890,7 @@
               <w:lang w:eastAsia="en-ID"/>
             </w:rPr>
           </w:pPr>
-          <w:hyperlink w:anchor="_Toc235049373" w:history="1">
+          <w:hyperlink w:anchor="_Toc235136682" w:history="1">
             <w:r>
               <w:rPr>
                 <w:rStyle w:val="Hyperlink"/>
@@ -2932,7 +2932,7 @@
                 <w:noProof/>
                 <w:webHidden/>
               </w:rPr>
-              <w:instrText xml:space="preserve"> PAGEREF _Toc235049373 \h </w:instrText>
+              <w:instrText xml:space="preserve"> PAGEREF _Toc235136682 \h </w:instrText>
             </w:r>
             <w:r>
               <w:rPr>
@@ -3001,7 +3001,7 @@
       <w:pPr>
         <w:pStyle w:val="Heading1"/>
       </w:pPr>
-      <w:bookmarkStart w:id="2" w:name="_Toc235049343"/>
+      <w:bookmarkStart w:id="2" w:name="_Toc235136652"/>
       <w:r>
         <w:lastRenderedPageBreak/>
         <w:t>BAB I</w:t>
@@ -3024,7 +3024,7 @@
         </w:numPr>
         <w:ind w:left="540" w:hanging="630"/>
       </w:pPr>
-      <w:bookmarkStart w:id="3" w:name="_Toc235049344"/>
+      <w:bookmarkStart w:id="3" w:name="_Toc235136653"/>
       <w:r>
         <w:t>Pendahuluan</w:t>
       </w:r>
@@ -3088,7 +3088,7 @@
         </w:numPr>
         <w:ind w:left="450" w:hanging="450"/>
       </w:pPr>
-      <w:bookmarkStart w:id="4" w:name="_Toc235049345"/>
+      <w:bookmarkStart w:id="4" w:name="_Toc235136654"/>
       <w:r>
         <w:t>Variabel (let dan const)</w:t>
       </w:r>
@@ -3697,7 +3697,7 @@
         </w:numPr>
         <w:ind w:left="450" w:hanging="450"/>
       </w:pPr>
-      <w:bookmarkStart w:id="5" w:name="_Toc235049346"/>
+      <w:bookmarkStart w:id="5" w:name="_Toc235136655"/>
       <w:r>
         <w:lastRenderedPageBreak/>
         <w:t>Arrow Function</w:t>
@@ -4190,7 +4190,7 @@
         </w:numPr>
         <w:ind w:left="450" w:hanging="450"/>
       </w:pPr>
-      <w:bookmarkStart w:id="6" w:name="_Toc235049347"/>
+      <w:bookmarkStart w:id="6" w:name="_Toc235136656"/>
       <w:r>
         <w:lastRenderedPageBreak/>
         <w:t>Template Literals</w:t>
@@ -4437,7 +4437,7 @@
         </w:numPr>
         <w:ind w:left="450" w:hanging="450"/>
       </w:pPr>
-      <w:bookmarkStart w:id="7" w:name="_Toc235049348"/>
+      <w:bookmarkStart w:id="7" w:name="_Toc235136657"/>
       <w:r>
         <w:lastRenderedPageBreak/>
         <w:t>Destructuring Assignment</w:t>
@@ -4887,7 +4887,7 @@
       <w:r>
         <w:br w:type="page"/>
       </w:r>
-      <w:bookmarkStart w:id="8" w:name="_Toc235049349"/>
+      <w:bookmarkStart w:id="8" w:name="_Toc235136658"/>
       <w:r>
         <w:lastRenderedPageBreak/>
         <w:t>Spread dan Rest Operator</w:t>
@@ -5207,7 +5207,7 @@
         </w:numPr>
         <w:ind w:left="450" w:hanging="450"/>
       </w:pPr>
-      <w:bookmarkStart w:id="9" w:name="_Toc235049350"/>
+      <w:bookmarkStart w:id="9" w:name="_Toc235136659"/>
       <w:r>
         <w:lastRenderedPageBreak/>
         <w:t>Ringkasan Bab</w:t>
@@ -5328,7 +5328,7 @@
       <w:pPr>
         <w:pStyle w:val="Heading1"/>
       </w:pPr>
-      <w:bookmarkStart w:id="10" w:name="_Toc235049351"/>
+      <w:bookmarkStart w:id="10" w:name="_Toc235136660"/>
       <w:r>
         <w:lastRenderedPageBreak/>
         <w:t>BAB 2</w:t>
@@ -5349,7 +5349,7 @@
         </w:numPr>
         <w:ind w:left="450" w:hanging="450"/>
       </w:pPr>
-      <w:bookmarkStart w:id="11" w:name="_Toc235049352"/>
+      <w:bookmarkStart w:id="11" w:name="_Toc235136661"/>
       <w:r>
         <w:t>Pendahuluan</w:t>
       </w:r>
@@ -5421,7 +5421,7 @@
         </w:numPr>
         <w:ind w:left="450" w:hanging="450"/>
       </w:pPr>
-      <w:bookmarkStart w:id="12" w:name="_Toc235049353"/>
+      <w:bookmarkStart w:id="12" w:name="_Toc235136662"/>
       <w:r>
         <w:t>Node.js</w:t>
       </w:r>
@@ -5916,7 +5916,7 @@
         </w:numPr>
         <w:ind w:left="426"/>
       </w:pPr>
-      <w:bookmarkStart w:id="13" w:name="_Toc235049354"/>
+      <w:bookmarkStart w:id="13" w:name="_Toc235136663"/>
       <w:r>
         <w:t>Pengenalan npm (Node Package Manager)</w:t>
       </w:r>
@@ -6755,7 +6755,7 @@
         </w:numPr>
         <w:ind w:left="426"/>
       </w:pPr>
-      <w:bookmarkStart w:id="14" w:name="_Toc235049355"/>
+      <w:bookmarkStart w:id="14" w:name="_Toc235136664"/>
       <w:r>
         <w:t>Pengenalan pnpm</w:t>
       </w:r>
@@ -7186,7 +7186,7 @@
         </w:numPr>
         <w:ind w:left="426"/>
       </w:pPr>
-      <w:bookmarkStart w:id="15" w:name="_Toc235049356"/>
+      <w:bookmarkStart w:id="15" w:name="_Toc235136665"/>
       <w:r>
         <w:lastRenderedPageBreak/>
         <w:t>Membuat dan Mengelola Project</w:t>
@@ -7664,7 +7664,7 @@
         </w:numPr>
         <w:ind w:left="426"/>
       </w:pPr>
-      <w:bookmarkStart w:id="16" w:name="_Toc235049357"/>
+      <w:bookmarkStart w:id="16" w:name="_Toc235136666"/>
       <w:r>
         <w:t>Ringkasan Bab</w:t>
       </w:r>
@@ -7733,7 +7733,7 @@
       <w:r>
         <w:br w:type="page"/>
       </w:r>
-      <w:bookmarkStart w:id="17" w:name="_Toc235049358"/>
+      <w:bookmarkStart w:id="17" w:name="_Toc235136667"/>
       <w:r>
         <w:lastRenderedPageBreak/>
         <w:t xml:space="preserve">BAB 3 </w:t>
@@ -7754,7 +7754,7 @@
         </w:numPr>
         <w:ind w:left="426"/>
       </w:pPr>
-      <w:bookmarkStart w:id="18" w:name="_Toc235049359"/>
+      <w:bookmarkStart w:id="18" w:name="_Toc235136668"/>
       <w:r>
         <w:t>Pendahuluan</w:t>
       </w:r>
@@ -7843,7 +7843,7 @@
         </w:numPr>
         <w:ind w:left="426"/>
       </w:pPr>
-      <w:bookmarkStart w:id="19" w:name="_Toc235049360"/>
+      <w:bookmarkStart w:id="19" w:name="_Toc235136669"/>
       <w:r>
         <w:t>Mengenal Vite</w:t>
       </w:r>
@@ -7971,7 +7971,7 @@
         </w:numPr>
         <w:ind w:left="426"/>
       </w:pPr>
-      <w:bookmarkStart w:id="20" w:name="_Toc235049361"/>
+      <w:bookmarkStart w:id="20" w:name="_Toc235136670"/>
       <w:r>
         <w:t>Membuat Project</w:t>
       </w:r>
@@ -8321,7 +8321,7 @@
         </w:numPr>
         <w:ind w:left="426"/>
       </w:pPr>
-      <w:bookmarkStart w:id="21" w:name="_Toc235049362"/>
+      <w:bookmarkStart w:id="21" w:name="_Toc235136671"/>
       <w:r>
         <w:t>Struktur Folder Project</w:t>
       </w:r>
@@ -8629,7 +8629,7 @@
         </w:numPr>
         <w:ind w:left="426"/>
       </w:pPr>
-      <w:bookmarkStart w:id="22" w:name="_Toc235049363"/>
+      <w:bookmarkStart w:id="22" w:name="_Toc235136672"/>
       <w:r>
         <w:t>Mengenal File package.json</w:t>
       </w:r>
@@ -8878,7 +8878,7 @@
         </w:numPr>
         <w:ind w:left="426"/>
       </w:pPr>
-      <w:bookmarkStart w:id="23" w:name="_Toc235049364"/>
+      <w:bookmarkStart w:id="23" w:name="_Toc235136673"/>
       <w:r>
         <w:lastRenderedPageBreak/>
         <w:t>Perintah Dasar pnpm</w:t>
@@ -9157,7 +9157,7 @@
         </w:numPr>
         <w:ind w:left="426"/>
       </w:pPr>
-      <w:bookmarkStart w:id="24" w:name="_Toc235049365"/>
+      <w:bookmarkStart w:id="24" w:name="_Toc235136674"/>
       <w:r>
         <w:t>Ringkasan Bab</w:t>
       </w:r>
@@ -9194,7 +9194,7 @@
       <w:pPr>
         <w:pStyle w:val="Heading1"/>
       </w:pPr>
-      <w:bookmarkStart w:id="25" w:name="_Toc235049366"/>
+      <w:bookmarkStart w:id="25" w:name="_Toc235136675"/>
       <w:r>
         <w:lastRenderedPageBreak/>
         <w:t xml:space="preserve">BAB 4 </w:t>
@@ -9217,7 +9217,7 @@
         </w:numPr>
         <w:ind w:left="426"/>
       </w:pPr>
-      <w:bookmarkStart w:id="26" w:name="_Toc235049367"/>
+      <w:bookmarkStart w:id="26" w:name="_Toc235136676"/>
       <w:r>
         <w:t>Pendahuluan</w:t>
       </w:r>
@@ -9249,7 +9249,7 @@
         </w:numPr>
         <w:ind w:left="426"/>
       </w:pPr>
-      <w:bookmarkStart w:id="27" w:name="_Toc235049368"/>
+      <w:bookmarkStart w:id="27" w:name="_Toc235136677"/>
       <w:r>
         <w:t>Apa itu React?</w:t>
       </w:r>
@@ -9352,6 +9352,56 @@
       <w:pPr>
         <w:ind w:firstLine="426"/>
       </w:pPr>
+      <w:r>
+        <w:rPr>
+          <w:noProof/>
+        </w:rPr>
+        <w:drawing>
+          <wp:inline distT="0" distB="0" distL="0" distR="0" wp14:anchorId="75B8BFD8" wp14:editId="4BA4B9E1">
+            <wp:extent cx="4922520" cy="7383780"/>
+            <wp:effectExtent l="0" t="0" r="0" b="7620"/>
+            <wp:docPr id="1710082653" name="Picture 4"/>
+            <wp:cNvGraphicFramePr>
+              <a:graphicFrameLocks xmlns:a="http://schemas.openxmlformats.org/drawingml/2006/main" noChangeAspect="1"/>
+            </wp:cNvGraphicFramePr>
+            <a:graphic xmlns:a="http://schemas.openxmlformats.org/drawingml/2006/main">
+              <a:graphicData uri="http://schemas.openxmlformats.org/drawingml/2006/picture">
+                <pic:pic xmlns:pic="http://schemas.openxmlformats.org/drawingml/2006/picture">
+                  <pic:nvPicPr>
+                    <pic:cNvPr id="0" name="Picture 3"/>
+                    <pic:cNvPicPr>
+                      <a:picLocks noChangeAspect="1" noChangeArrowheads="1"/>
+                    </pic:cNvPicPr>
+                  </pic:nvPicPr>
+                  <pic:blipFill>
+                    <a:blip r:embed="rId72">
+                      <a:extLst>
+                        <a:ext uri="{28A0092B-C50C-407E-A947-70E740481C1C}">
+                          <a14:useLocalDpi xmlns:a14="http://schemas.microsoft.com/office/drawing/2010/main" val="0"/>
+                        </a:ext>
+                      </a:extLst>
+                    </a:blip>
+                    <a:srcRect/>
+                    <a:stretch>
+                      <a:fillRect/>
+                    </a:stretch>
+                  </pic:blipFill>
+                  <pic:spPr bwMode="auto">
+                    <a:xfrm>
+                      <a:off x="0" y="0"/>
+                      <a:ext cx="4922520" cy="7383780"/>
+                    </a:xfrm>
+                    <a:prstGeom prst="rect">
+                      <a:avLst/>
+                    </a:prstGeom>
+                    <a:noFill/>
+                  </pic:spPr>
+                </pic:pic>
+              </a:graphicData>
+            </a:graphic>
+          </wp:inline>
+        </w:drawing>
+      </w:r>
     </w:p>
     <w:p>
       <w:pPr>
@@ -9362,8 +9412,9 @@
         </w:numPr>
         <w:ind w:left="426"/>
       </w:pPr>
-      <w:bookmarkStart w:id="28" w:name="_Toc235049369"/>
-      <w:r>
+      <w:bookmarkStart w:id="28" w:name="_Toc235136678"/>
+      <w:r>
+        <w:lastRenderedPageBreak/>
         <w:t>Mengenal JSX</w:t>
       </w:r>
       <w:bookmarkEnd w:id="28"/>
@@ -9419,7 +9470,7 @@
                     <pic:cNvPicPr/>
                   </pic:nvPicPr>
                   <pic:blipFill>
-                    <a:blip r:embed="rId72"/>
+                    <a:blip r:embed="rId73"/>
                     <a:stretch>
                       <a:fillRect/>
                     </a:stretch>
@@ -9536,7 +9587,7 @@
                     <pic:cNvPicPr/>
                   </pic:nvPicPr>
                   <pic:blipFill>
-                    <a:blip r:embed="rId73"/>
+                    <a:blip r:embed="rId74"/>
                     <a:stretch>
                       <a:fillRect/>
                     </a:stretch>
@@ -9567,18 +9618,18 @@
         <w:ind w:firstLine="426"/>
       </w:pPr>
       <w:r>
+        <w:t>Dengan JSX:</w:t>
+      </w:r>
+    </w:p>
+    <w:p>
+      <w:pPr>
+        <w:ind w:firstLine="426"/>
+      </w:pPr>
+      <w:r>
+        <w:rPr>
+          <w:noProof/>
+        </w:rPr>
         <w:lastRenderedPageBreak/>
-        <w:t>Dengan JSX:</w:t>
-      </w:r>
-    </w:p>
-    <w:p>
-      <w:pPr>
-        <w:ind w:firstLine="426"/>
-      </w:pPr>
-      <w:r>
-        <w:rPr>
-          <w:noProof/>
-        </w:rPr>
         <w:drawing>
           <wp:inline distT="0" distB="0" distL="0" distR="0" wp14:anchorId="431A2469" wp14:editId="5CF3B5F8">
             <wp:extent cx="4448796" cy="828791"/>
@@ -9595,7 +9646,7 @@
                     <pic:cNvPicPr/>
                   </pic:nvPicPr>
                   <pic:blipFill>
-                    <a:blip r:embed="rId74"/>
+                    <a:blip r:embed="rId75"/>
                     <a:stretch>
                       <a:fillRect/>
                     </a:stretch>
@@ -9694,7 +9745,7 @@
                     <pic:cNvPicPr/>
                   </pic:nvPicPr>
                   <pic:blipFill>
-                    <a:blip r:embed="rId75"/>
+                    <a:blip r:embed="rId76"/>
                     <a:stretch>
                       <a:fillRect/>
                     </a:stretch>
@@ -9749,7 +9800,7 @@
                     <pic:cNvPicPr/>
                   </pic:nvPicPr>
                   <pic:blipFill>
-                    <a:blip r:embed="rId76"/>
+                    <a:blip r:embed="rId77"/>
                     <a:stretch>
                       <a:fillRect/>
                     </a:stretch>
@@ -9800,7 +9851,6 @@
         <w:rPr>
           <w:noProof/>
         </w:rPr>
-        <w:lastRenderedPageBreak/>
         <w:drawing>
           <wp:inline distT="0" distB="0" distL="0" distR="0" wp14:anchorId="13035784" wp14:editId="02411097">
             <wp:extent cx="4391638" cy="1228896"/>
@@ -9817,7 +9867,7 @@
                     <pic:cNvPicPr/>
                   </pic:nvPicPr>
                   <pic:blipFill>
-                    <a:blip r:embed="rId77"/>
+                    <a:blip r:embed="rId78"/>
                     <a:stretch>
                       <a:fillRect/>
                     </a:stretch>
@@ -9853,6 +9903,7 @@
         </w:numPr>
       </w:pPr>
       <w:r>
+        <w:lastRenderedPageBreak/>
         <w:t>Gunakan Kurung Kurawal {}</w:t>
       </w:r>
     </w:p>
@@ -9870,7 +9921,7 @@
         </w:numPr>
         <w:ind w:left="426"/>
       </w:pPr>
-      <w:bookmarkStart w:id="29" w:name="_Toc235049370"/>
+      <w:bookmarkStart w:id="29" w:name="_Toc235136679"/>
       <w:r>
         <w:t>Mengenal Komponen</w:t>
       </w:r>
@@ -9988,7 +10039,6 @@
         <w:rPr>
           <w:noProof/>
         </w:rPr>
-        <w:lastRenderedPageBreak/>
         <w:drawing>
           <wp:inline distT="0" distB="0" distL="0" distR="0" wp14:anchorId="32D80AF5" wp14:editId="252914B9">
             <wp:extent cx="4086795" cy="2010056"/>
@@ -10005,7 +10055,7 @@
                     <pic:cNvPicPr/>
                   </pic:nvPicPr>
                   <pic:blipFill>
-                    <a:blip r:embed="rId78"/>
+                    <a:blip r:embed="rId79"/>
                     <a:stretch>
                       <a:fillRect/>
                     </a:stretch>
@@ -10039,6 +10089,7 @@
         <w:rPr>
           <w:noProof/>
         </w:rPr>
+        <w:lastRenderedPageBreak/>
         <w:drawing>
           <wp:inline distT="0" distB="0" distL="0" distR="0" wp14:anchorId="526C1770" wp14:editId="17CBF729">
             <wp:extent cx="4058216" cy="2000529"/>
@@ -10055,7 +10106,7 @@
                     <pic:cNvPicPr/>
                   </pic:nvPicPr>
                   <pic:blipFill>
-                    <a:blip r:embed="rId79"/>
+                    <a:blip r:embed="rId80"/>
                     <a:stretch>
                       <a:fillRect/>
                     </a:stretch>
@@ -10091,7 +10142,7 @@
         </w:numPr>
         <w:ind w:left="426"/>
       </w:pPr>
-      <w:bookmarkStart w:id="30" w:name="_Toc235049371"/>
+      <w:bookmarkStart w:id="30" w:name="_Toc235136680"/>
       <w:r>
         <w:t>Membuat Komponen Pertama</w:t>
       </w:r>
@@ -10132,7 +10183,7 @@
                     <pic:cNvPicPr/>
                   </pic:nvPicPr>
                   <pic:blipFill>
-                    <a:blip r:embed="rId80"/>
+                    <a:blip r:embed="rId81"/>
                     <a:stretch>
                       <a:fillRect/>
                     </a:stretch>
@@ -10163,7 +10214,6 @@
         <w:rPr>
           <w:noProof/>
         </w:rPr>
-        <w:lastRenderedPageBreak/>
         <w:drawing>
           <wp:inline distT="0" distB="0" distL="0" distR="0" wp14:anchorId="4CA8793D" wp14:editId="763FF1CC">
             <wp:extent cx="4525006" cy="2543530"/>
@@ -10180,7 +10230,7 @@
                     <pic:cNvPicPr/>
                   </pic:nvPicPr>
                   <pic:blipFill>
-                    <a:blip r:embed="rId81"/>
+                    <a:blip r:embed="rId82"/>
                     <a:stretch>
                       <a:fillRect/>
                     </a:stretch>
@@ -10211,8 +10261,9 @@
         </w:numPr>
         <w:ind w:left="426"/>
       </w:pPr>
-      <w:bookmarkStart w:id="31" w:name="_Toc235049372"/>
-      <w:r>
+      <w:bookmarkStart w:id="31" w:name="_Toc235136681"/>
+      <w:r>
+        <w:lastRenderedPageBreak/>
         <w:t>Menggunakan Komponen</w:t>
       </w:r>
       <w:bookmarkEnd w:id="31"/>
@@ -10243,7 +10294,7 @@
                     <pic:cNvPicPr/>
                   </pic:nvPicPr>
                   <pic:blipFill>
-                    <a:blip r:embed="rId82"/>
+                    <a:blip r:embed="rId83"/>
                     <a:stretch>
                       <a:fillRect/>
                     </a:stretch>
@@ -10290,7 +10341,7 @@
                     <pic:cNvPicPr/>
                   </pic:nvPicPr>
                   <pic:blipFill>
-                    <a:blip r:embed="rId83"/>
+                    <a:blip r:embed="rId84"/>
                     <a:stretch>
                       <a:fillRect/>
                     </a:stretch>
@@ -10321,32 +10372,35 @@
         </w:numPr>
         <w:ind w:left="426"/>
       </w:pPr>
-      <w:bookmarkStart w:id="32" w:name="_Toc235049373"/>
+      <w:bookmarkStart w:id="32" w:name="_Toc235136682"/>
+      <w:r>
+        <w:t>Ringkasan Bab</w:t>
+      </w:r>
+      <w:bookmarkEnd w:id="32"/>
+    </w:p>
+    <w:p>
+      <w:pPr>
+        <w:ind w:firstLine="426"/>
+      </w:pPr>
+      <w:r>
+        <w:t>Pada bab ini peserta telah mempelajari konsep dasar React, mengenal JSX sebagai sintaks untuk membangun antarmuka pengguna, serta memahami bagaimana aplikasi React disusun menggunakan Functional Component. Peserta juga telah berhasil membuat beberapa komponen sederhana dan menyusunnya menjadi tampilan awal aplikasi CareerHub.</w:t>
+      </w:r>
+    </w:p>
+    <w:p>
+      <w:pPr>
+        <w:ind w:firstLine="426"/>
+      </w:pPr>
+      <w:r>
+        <w:t xml:space="preserve">Struktur komponen yang dibuat pada bab ini akan menjadi fondasi pengembangan aplikasi pada bab-bab selanjutnya. Pada Bab 5, peserta akan mempelajari Props, sehingga komponen JobCard tidak lagi menampilkan data statis, melainkan menerima data secara dinamis dari komponen induknya. Dengan </w:t>
+      </w:r>
       <w:r>
         <w:lastRenderedPageBreak/>
-        <w:t>Ringkasan Bab</w:t>
-      </w:r>
-      <w:bookmarkEnd w:id="32"/>
-    </w:p>
-    <w:p>
-      <w:pPr>
-        <w:ind w:firstLine="426"/>
-      </w:pPr>
-      <w:r>
-        <w:t>Pada bab ini peserta telah mempelajari konsep dasar React, mengenal JSX sebagai sintaks untuk membangun antarmuka pengguna, serta memahami bagaimana aplikasi React disusun menggunakan Functional Component. Peserta juga telah berhasil membuat beberapa komponen sederhana dan menyusunnya menjadi tampilan awal aplikasi CareerHub.</w:t>
-      </w:r>
-    </w:p>
-    <w:p>
-      <w:pPr>
-        <w:ind w:firstLine="426"/>
-      </w:pPr>
-      <w:r>
-        <w:t>Struktur komponen yang dibuat pada bab ini akan menjadi fondasi pengembangan aplikasi pada bab-bab selanjutnya. Pada Bab 5, peserta akan mempelajari Props, sehingga komponen JobCard tidak lagi menampilkan data statis, melainkan menerima data secara dinamis dari komponen induknya. Dengan demikian, aplikasi CareerHub akan mulai menampilkan daftar lowongan pekerjaan yang lebih fleksibel dan mudah dikelola.</w:t>
+        <w:t>demikian, aplikasi CareerHub akan mulai menampilkan daftar lowongan pekerjaan yang lebih fleksibel dan mudah dikelola.</w:t>
       </w:r>
     </w:p>
     <w:sectPr>
-      <w:headerReference w:type="default" r:id="rId84"/>
-      <w:footerReference w:type="default" r:id="rId85"/>
+      <w:headerReference w:type="default" r:id="rId85"/>
+      <w:footerReference w:type="default" r:id="rId86"/>
       <w:pgSz w:w="11906" w:h="16838"/>
       <w:pgMar w:top="1440" w:right="1440" w:bottom="1440" w:left="1440" w:header="708" w:footer="708" w:gutter="0"/>
       <w:pgNumType w:start="1"/>

</xml_diff>